<commit_message>
docs: rewrite the crisp 17-slide narration script
</commit_message>
<xml_diff>
--- a/presentation/ParaBank_Demo_Script.docx
+++ b/presentation/ParaBank_Demo_Script.docx
@@ -50,7 +50,7 @@
           <w:sz w:val="22"/>
           <w:szCs w:val="22"/>
         </w:rPr>
-        <w:t xml:space="preserve">Slide-by-slide script for a 6-8 minute recorded walkthrough</w:t>
+        <w:t xml:space="preserve">Crisp, slide-by-slide script for a 10-12 minute recorded walkthrough</w:t>
       </w:r>
     </w:p>
     <w:tbl>
@@ -283,7 +283,7 @@
                 <w:sz w:val="18"/>
                 <w:szCs w:val="18"/>
               </w:rPr>
-              <w:t xml:space="preserve">ParaBank_Assessment_Demo.pptx (11 slides)</w:t>
+              <w:t xml:space="preserve">ParaBank_Assessment_Demo.pptx (17 slides)</w:t>
             </w:r>
           </w:p>
         </w:tc>
@@ -353,7 +353,7 @@
                 <w:sz w:val="18"/>
                 <w:szCs w:val="18"/>
               </w:rPr>
-              <w:t xml:space="preserve">6 - 8 minutes</w:t>
+              <w:t xml:space="preserve">10 - 12 minutes</w:t>
             </w:r>
           </w:p>
         </w:tc>
@@ -525,7 +525,7 @@
         <w:rPr>
           <w:rFonts w:ascii="Arial" w:cs="Arial" w:eastAsia="Arial" w:hAnsi="Arial"/>
         </w:rPr>
-        <w:t xml:space="preserve">Each slide below has a SAY block - the words to narrate - and, where relevant, a DO block listing the screen actions to perform. Speak naturally; the script is a guide, not a word-for-word cue card. Aim for a calm, even pace of roughly 130-140 words per minute.</w:t>
+        <w:t xml:space="preserve">Each slide has a SAY block - the words to narrate - kept short and crisp. Slide 12 also has a DO block listing the live-demo screen actions. Speak naturally at about 135 words per minute; the script is a guide, not a word-for-word cue card.</w:t>
       </w:r>
     </w:p>
     <w:p>
@@ -543,7 +543,7 @@
           <w:sz w:val="21"/>
           <w:szCs w:val="21"/>
         </w:rPr>
-        <w:t xml:space="preserve">Record the slides and the live demo in one pass, or record them separately and stitch them.</w:t>
+        <w:t xml:space="preserve">The deck runs 17 slides; the narration plus the live demo totals about 12 minutes - comfortably over the 10-minute minimum.</w:t>
       </w:r>
     </w:p>
     <w:p>
@@ -561,7 +561,7 @@
           <w:sz w:val="21"/>
           <w:szCs w:val="21"/>
         </w:rPr>
-        <w:t xml:space="preserve">The demo (Slide 7) is the longest segment - if the full run is slow, show it sped up or pre-recorded.</w:t>
+        <w:t xml:space="preserve">Slide 12 is the live demo - the longest segment. Record the suite running separately and splice it in, or present it live.</w:t>
       </w:r>
     </w:p>
     <w:p>
@@ -579,7 +579,7 @@
           <w:sz w:val="21"/>
           <w:szCs w:val="21"/>
         </w:rPr>
-        <w:t xml:space="preserve">Keep the total between 6 and 8 minutes; trim the demo first if you run long.</w:t>
+        <w:t xml:space="preserve">If you run long, trim the demo first; if short, expand the demo narration.</w:t>
       </w:r>
     </w:p>
     <w:p>
@@ -597,7 +597,7 @@
           <w:sz w:val="21"/>
           <w:szCs w:val="21"/>
         </w:rPr>
-        <w:t xml:space="preserve">The same narration is also saved in each slide’s Notes panel inside the .pptx.</w:t>
+        <w:t xml:space="preserve">The same narration is in each slide’s Notes panel inside the .pptx.</w:t>
       </w:r>
     </w:p>
     <w:p>
@@ -625,8 +625,8 @@
       </w:tblPr>
       <w:tblGrid>
         <w:gridCol w:w="900"/>
-        <w:gridCol w:w="4260"/>
-        <w:gridCol w:w="1800"/>
+        <w:gridCol w:w="4560"/>
+        <w:gridCol w:w="1500"/>
         <w:gridCol w:w="2400"/>
       </w:tblGrid>
       <w:tr>
@@ -671,7 +671,7 @@
         </w:tc>
         <w:tc>
           <w:tcPr>
-            <w:tcW w:type="dxa" w:w="4260"/>
+            <w:tcW w:type="dxa" w:w="4560"/>
             <w:tcBorders>
               <w:top w:val="single" w:color="BFBFBF" w:sz="1"/>
               <w:left w:val="single" w:color="BFBFBF" w:sz="1"/>
@@ -707,7 +707,7 @@
         </w:tc>
         <w:tc>
           <w:tcPr>
-            <w:tcW w:type="dxa" w:w="1800"/>
+            <w:tcW w:type="dxa" w:w="1500"/>
             <w:tcBorders>
               <w:top w:val="single" w:color="BFBFBF" w:sz="1"/>
               <w:left w:val="single" w:color="BFBFBF" w:sz="1"/>
@@ -815,7 +815,7 @@
         </w:tc>
         <w:tc>
           <w:tcPr>
-            <w:tcW w:type="dxa" w:w="4260"/>
+            <w:tcW w:type="dxa" w:w="4560"/>
             <w:tcBorders>
               <w:top w:val="single" w:color="BFBFBF" w:sz="1"/>
               <w:left w:val="single" w:color="BFBFBF" w:sz="1"/>
@@ -849,35 +849,35 @@
         </w:tc>
         <w:tc>
           <w:tcPr>
-            <w:tcW w:type="dxa" w:w="1800"/>
-            <w:tcBorders>
-              <w:top w:val="single" w:color="BFBFBF" w:sz="1"/>
-              <w:left w:val="single" w:color="BFBFBF" w:sz="1"/>
-              <w:bottom w:val="single" w:color="BFBFBF" w:sz="1"/>
-              <w:right w:val="single" w:color="BFBFBF" w:sz="1"/>
-            </w:tcBorders>
-            <w:tcMar>
-              <w:top w:type="dxa" w:w="60"/>
-              <w:left w:type="dxa" w:w="110"/>
-              <w:bottom w:type="dxa" w:w="60"/>
-              <w:right w:type="dxa" w:w="110"/>
-            </w:tcMar>
-            <w:vAlign w:val="center"/>
-          </w:tcPr>
-          <w:p>
-            <w:pPr>
-              <w:spacing w:after="0"/>
-              <w:jc w:val="center"/>
-            </w:pPr>
-            <w:r>
-              <w:rPr>
-                <w:rFonts w:ascii="Arial" w:cs="Arial" w:eastAsia="Arial" w:hAnsi="Arial"/>
-                <w:b w:val="false"/>
-                <w:bCs w:val="false"/>
-                <w:sz w:val="18"/>
-                <w:szCs w:val="18"/>
-              </w:rPr>
-              <w:t xml:space="preserve">0:25</w:t>
+            <w:tcW w:type="dxa" w:w="1500"/>
+            <w:tcBorders>
+              <w:top w:val="single" w:color="BFBFBF" w:sz="1"/>
+              <w:left w:val="single" w:color="BFBFBF" w:sz="1"/>
+              <w:bottom w:val="single" w:color="BFBFBF" w:sz="1"/>
+              <w:right w:val="single" w:color="BFBFBF" w:sz="1"/>
+            </w:tcBorders>
+            <w:tcMar>
+              <w:top w:type="dxa" w:w="60"/>
+              <w:left w:type="dxa" w:w="110"/>
+              <w:bottom w:type="dxa" w:w="60"/>
+              <w:right w:type="dxa" w:w="110"/>
+            </w:tcMar>
+            <w:vAlign w:val="center"/>
+          </w:tcPr>
+          <w:p>
+            <w:pPr>
+              <w:spacing w:after="0"/>
+              <w:jc w:val="center"/>
+            </w:pPr>
+            <w:r>
+              <w:rPr>
+                <w:rFonts w:ascii="Arial" w:cs="Arial" w:eastAsia="Arial" w:hAnsi="Arial"/>
+                <w:b w:val="false"/>
+                <w:bCs w:val="false"/>
+                <w:sz w:val="18"/>
+                <w:szCs w:val="18"/>
+              </w:rPr>
+              <w:t xml:space="preserve">0:22</w:t>
             </w:r>
           </w:p>
         </w:tc>
@@ -911,7 +911,7 @@
                 <w:sz w:val="18"/>
                 <w:szCs w:val="18"/>
               </w:rPr>
-              <w:t xml:space="preserve">0:25</w:t>
+              <w:t xml:space="preserve">0:22</w:t>
             </w:r>
           </w:p>
         </w:tc>
@@ -954,7 +954,7 @@
         </w:tc>
         <w:tc>
           <w:tcPr>
-            <w:tcW w:type="dxa" w:w="4260"/>
+            <w:tcW w:type="dxa" w:w="4560"/>
             <w:tcBorders>
               <w:top w:val="single" w:color="BFBFBF" w:sz="1"/>
               <w:left w:val="single" w:color="BFBFBF" w:sz="1"/>
@@ -989,7 +989,7 @@
         </w:tc>
         <w:tc>
           <w:tcPr>
-            <w:tcW w:type="dxa" w:w="1800"/>
+            <w:tcW w:type="dxa" w:w="1500"/>
             <w:tcBorders>
               <w:top w:val="single" w:color="BFBFBF" w:sz="1"/>
               <w:left w:val="single" w:color="BFBFBF" w:sz="1"/>
@@ -1018,7 +1018,7 @@
                 <w:sz w:val="18"/>
                 <w:szCs w:val="18"/>
               </w:rPr>
-              <w:t xml:space="preserve">0:40</w:t>
+              <w:t xml:space="preserve">0:38</w:t>
             </w:r>
           </w:p>
         </w:tc>
@@ -1053,7 +1053,7 @@
                 <w:sz w:val="18"/>
                 <w:szCs w:val="18"/>
               </w:rPr>
-              <w:t xml:space="preserve">1:05</w:t>
+              <w:t xml:space="preserve">1:00</w:t>
             </w:r>
           </w:p>
         </w:tc>
@@ -1095,69 +1095,69 @@
         </w:tc>
         <w:tc>
           <w:tcPr>
-            <w:tcW w:type="dxa" w:w="4260"/>
-            <w:tcBorders>
-              <w:top w:val="single" w:color="BFBFBF" w:sz="1"/>
-              <w:left w:val="single" w:color="BFBFBF" w:sz="1"/>
-              <w:bottom w:val="single" w:color="BFBFBF" w:sz="1"/>
-              <w:right w:val="single" w:color="BFBFBF" w:sz="1"/>
-            </w:tcBorders>
-            <w:tcMar>
-              <w:top w:type="dxa" w:w="60"/>
-              <w:left w:type="dxa" w:w="110"/>
-              <w:bottom w:type="dxa" w:w="60"/>
-              <w:right w:type="dxa" w:w="110"/>
-            </w:tcMar>
-            <w:vAlign w:val="center"/>
-          </w:tcPr>
-          <w:p>
-            <w:pPr>
-              <w:spacing w:after="0"/>
-              <w:jc w:val="center"/>
-            </w:pPr>
-            <w:r>
-              <w:rPr>
-                <w:rFonts w:ascii="Arial" w:cs="Arial" w:eastAsia="Arial" w:hAnsi="Arial"/>
-                <w:b w:val="false"/>
-                <w:bCs w:val="false"/>
-                <w:sz w:val="18"/>
-                <w:szCs w:val="18"/>
-              </w:rPr>
-              <w:t xml:space="preserve">Approach &amp; tech stack</w:t>
-            </w:r>
-          </w:p>
-        </w:tc>
-        <w:tc>
-          <w:tcPr>
-            <w:tcW w:type="dxa" w:w="1800"/>
-            <w:tcBorders>
-              <w:top w:val="single" w:color="BFBFBF" w:sz="1"/>
-              <w:left w:val="single" w:color="BFBFBF" w:sz="1"/>
-              <w:bottom w:val="single" w:color="BFBFBF" w:sz="1"/>
-              <w:right w:val="single" w:color="BFBFBF" w:sz="1"/>
-            </w:tcBorders>
-            <w:tcMar>
-              <w:top w:type="dxa" w:w="60"/>
-              <w:left w:type="dxa" w:w="110"/>
-              <w:bottom w:type="dxa" w:w="60"/>
-              <w:right w:type="dxa" w:w="110"/>
-            </w:tcMar>
-            <w:vAlign w:val="center"/>
-          </w:tcPr>
-          <w:p>
-            <w:pPr>
-              <w:spacing w:after="0"/>
-              <w:jc w:val="center"/>
-            </w:pPr>
-            <w:r>
-              <w:rPr>
-                <w:rFonts w:ascii="Arial" w:cs="Arial" w:eastAsia="Arial" w:hAnsi="Arial"/>
-                <w:b w:val="false"/>
-                <w:bCs w:val="false"/>
-                <w:sz w:val="18"/>
-                <w:szCs w:val="18"/>
-              </w:rPr>
-              <w:t xml:space="preserve">0:40</w:t>
+            <w:tcW w:type="dxa" w:w="4560"/>
+            <w:tcBorders>
+              <w:top w:val="single" w:color="BFBFBF" w:sz="1"/>
+              <w:left w:val="single" w:color="BFBFBF" w:sz="1"/>
+              <w:bottom w:val="single" w:color="BFBFBF" w:sz="1"/>
+              <w:right w:val="single" w:color="BFBFBF" w:sz="1"/>
+            </w:tcBorders>
+            <w:tcMar>
+              <w:top w:type="dxa" w:w="60"/>
+              <w:left w:type="dxa" w:w="110"/>
+              <w:bottom w:type="dxa" w:w="60"/>
+              <w:right w:type="dxa" w:w="110"/>
+            </w:tcMar>
+            <w:vAlign w:val="center"/>
+          </w:tcPr>
+          <w:p>
+            <w:pPr>
+              <w:spacing w:after="0"/>
+              <w:jc w:val="center"/>
+            </w:pPr>
+            <w:r>
+              <w:rPr>
+                <w:rFonts w:ascii="Arial" w:cs="Arial" w:eastAsia="Arial" w:hAnsi="Arial"/>
+                <w:b w:val="false"/>
+                <w:bCs w:val="false"/>
+                <w:sz w:val="18"/>
+                <w:szCs w:val="18"/>
+              </w:rPr>
+              <w:t xml:space="preserve">The application &amp; core flow</w:t>
+            </w:r>
+          </w:p>
+        </w:tc>
+        <w:tc>
+          <w:tcPr>
+            <w:tcW w:type="dxa" w:w="1500"/>
+            <w:tcBorders>
+              <w:top w:val="single" w:color="BFBFBF" w:sz="1"/>
+              <w:left w:val="single" w:color="BFBFBF" w:sz="1"/>
+              <w:bottom w:val="single" w:color="BFBFBF" w:sz="1"/>
+              <w:right w:val="single" w:color="BFBFBF" w:sz="1"/>
+            </w:tcBorders>
+            <w:tcMar>
+              <w:top w:type="dxa" w:w="60"/>
+              <w:left w:type="dxa" w:w="110"/>
+              <w:bottom w:type="dxa" w:w="60"/>
+              <w:right w:type="dxa" w:w="110"/>
+            </w:tcMar>
+            <w:vAlign w:val="center"/>
+          </w:tcPr>
+          <w:p>
+            <w:pPr>
+              <w:spacing w:after="0"/>
+              <w:jc w:val="center"/>
+            </w:pPr>
+            <w:r>
+              <w:rPr>
+                <w:rFonts w:ascii="Arial" w:cs="Arial" w:eastAsia="Arial" w:hAnsi="Arial"/>
+                <w:b w:val="false"/>
+                <w:bCs w:val="false"/>
+                <w:sz w:val="18"/>
+                <w:szCs w:val="18"/>
+              </w:rPr>
+              <w:t xml:space="preserve">0:35</w:t>
             </w:r>
           </w:p>
         </w:tc>
@@ -1191,7 +1191,7 @@
                 <w:sz w:val="18"/>
                 <w:szCs w:val="18"/>
               </w:rPr>
-              <w:t xml:space="preserve">1:45</w:t>
+              <w:t xml:space="preserve">1:35</w:t>
             </w:r>
           </w:p>
         </w:tc>
@@ -1234,7 +1234,7 @@
         </w:tc>
         <w:tc>
           <w:tcPr>
-            <w:tcW w:type="dxa" w:w="4260"/>
+            <w:tcW w:type="dxa" w:w="4560"/>
             <w:tcBorders>
               <w:top w:val="single" w:color="BFBFBF" w:sz="1"/>
               <w:left w:val="single" w:color="BFBFBF" w:sz="1"/>
@@ -1263,13 +1263,13 @@
                 <w:sz w:val="18"/>
                 <w:szCs w:val="18"/>
               </w:rPr>
-              <w:t xml:space="preserve">Framework architecture</w:t>
-            </w:r>
-          </w:p>
-        </w:tc>
-        <w:tc>
-          <w:tcPr>
-            <w:tcW w:type="dxa" w:w="1800"/>
+              <w:t xml:space="preserve">Approach &amp; tech stack</w:t>
+            </w:r>
+          </w:p>
+        </w:tc>
+        <w:tc>
+          <w:tcPr>
+            <w:tcW w:type="dxa" w:w="1500"/>
             <w:tcBorders>
               <w:top w:val="single" w:color="BFBFBF" w:sz="1"/>
               <w:left w:val="single" w:color="BFBFBF" w:sz="1"/>
@@ -1298,7 +1298,7 @@
                 <w:sz w:val="18"/>
                 <w:szCs w:val="18"/>
               </w:rPr>
-              <w:t xml:space="preserve">0:35</w:t>
+              <w:t xml:space="preserve">0:38</w:t>
             </w:r>
           </w:p>
         </w:tc>
@@ -1333,7 +1333,7 @@
                 <w:sz w:val="18"/>
                 <w:szCs w:val="18"/>
               </w:rPr>
-              <w:t xml:space="preserve">2:20</w:t>
+              <w:t xml:space="preserve">2:13</w:t>
             </w:r>
           </w:p>
         </w:tc>
@@ -1375,41 +1375,41 @@
         </w:tc>
         <w:tc>
           <w:tcPr>
-            <w:tcW w:type="dxa" w:w="4260"/>
-            <w:tcBorders>
-              <w:top w:val="single" w:color="BFBFBF" w:sz="1"/>
-              <w:left w:val="single" w:color="BFBFBF" w:sz="1"/>
-              <w:bottom w:val="single" w:color="BFBFBF" w:sz="1"/>
-              <w:right w:val="single" w:color="BFBFBF" w:sz="1"/>
-            </w:tcBorders>
-            <w:tcMar>
-              <w:top w:type="dxa" w:w="60"/>
-              <w:left w:type="dxa" w:w="110"/>
-              <w:bottom w:type="dxa" w:w="60"/>
-              <w:right w:type="dxa" w:w="110"/>
-            </w:tcMar>
-            <w:vAlign w:val="center"/>
-          </w:tcPr>
-          <w:p>
-            <w:pPr>
-              <w:spacing w:after="0"/>
-              <w:jc w:val="center"/>
-            </w:pPr>
-            <w:r>
-              <w:rPr>
-                <w:rFonts w:ascii="Arial" w:cs="Arial" w:eastAsia="Arial" w:hAnsi="Arial"/>
-                <w:b w:val="false"/>
-                <w:bCs w:val="false"/>
-                <w:sz w:val="18"/>
-                <w:szCs w:val="18"/>
-              </w:rPr>
-              <w:t xml:space="preserve">Test coverage</w:t>
-            </w:r>
-          </w:p>
-        </w:tc>
-        <w:tc>
-          <w:tcPr>
-            <w:tcW w:type="dxa" w:w="1800"/>
+            <w:tcW w:type="dxa" w:w="4560"/>
+            <w:tcBorders>
+              <w:top w:val="single" w:color="BFBFBF" w:sz="1"/>
+              <w:left w:val="single" w:color="BFBFBF" w:sz="1"/>
+              <w:bottom w:val="single" w:color="BFBFBF" w:sz="1"/>
+              <w:right w:val="single" w:color="BFBFBF" w:sz="1"/>
+            </w:tcBorders>
+            <w:tcMar>
+              <w:top w:type="dxa" w:w="60"/>
+              <w:left w:type="dxa" w:w="110"/>
+              <w:bottom w:type="dxa" w:w="60"/>
+              <w:right w:type="dxa" w:w="110"/>
+            </w:tcMar>
+            <w:vAlign w:val="center"/>
+          </w:tcPr>
+          <w:p>
+            <w:pPr>
+              <w:spacing w:after="0"/>
+              <w:jc w:val="center"/>
+            </w:pPr>
+            <w:r>
+              <w:rPr>
+                <w:rFonts w:ascii="Arial" w:cs="Arial" w:eastAsia="Arial" w:hAnsi="Arial"/>
+                <w:b w:val="false"/>
+                <w:bCs w:val="false"/>
+                <w:sz w:val="18"/>
+                <w:szCs w:val="18"/>
+              </w:rPr>
+              <w:t xml:space="preserve">Framework architecture</w:t>
+            </w:r>
+          </w:p>
+        </w:tc>
+        <w:tc>
+          <w:tcPr>
+            <w:tcW w:type="dxa" w:w="1500"/>
             <w:tcBorders>
               <w:top w:val="single" w:color="BFBFBF" w:sz="1"/>
               <w:left w:val="single" w:color="BFBFBF" w:sz="1"/>
@@ -1471,7 +1471,7 @@
                 <w:sz w:val="18"/>
                 <w:szCs w:val="18"/>
               </w:rPr>
-              <w:t xml:space="preserve">2:55</w:t>
+              <w:t xml:space="preserve">2:48</w:t>
             </w:r>
           </w:p>
         </w:tc>
@@ -1514,7 +1514,7 @@
         </w:tc>
         <w:tc>
           <w:tcPr>
-            <w:tcW w:type="dxa" w:w="4260"/>
+            <w:tcW w:type="dxa" w:w="4560"/>
             <w:tcBorders>
               <w:top w:val="single" w:color="BFBFBF" w:sz="1"/>
               <w:left w:val="single" w:color="BFBFBF" w:sz="1"/>
@@ -1543,13 +1543,13 @@
                 <w:sz w:val="18"/>
                 <w:szCs w:val="18"/>
               </w:rPr>
-              <w:t xml:space="preserve">Deep testing</w:t>
-            </w:r>
-          </w:p>
-        </w:tc>
-        <w:tc>
-          <w:tcPr>
-            <w:tcW w:type="dxa" w:w="1800"/>
+              <w:t xml:space="preserve">BDD in action</w:t>
+            </w:r>
+          </w:p>
+        </w:tc>
+        <w:tc>
+          <w:tcPr>
+            <w:tcW w:type="dxa" w:w="1500"/>
             <w:tcBorders>
               <w:top w:val="single" w:color="BFBFBF" w:sz="1"/>
               <w:left w:val="single" w:color="BFBFBF" w:sz="1"/>
@@ -1578,7 +1578,7 @@
                 <w:sz w:val="18"/>
                 <w:szCs w:val="18"/>
               </w:rPr>
-              <w:t xml:space="preserve">0:45</w:t>
+              <w:t xml:space="preserve">0:38</w:t>
             </w:r>
           </w:p>
         </w:tc>
@@ -1613,7 +1613,7 @@
                 <w:sz w:val="18"/>
                 <w:szCs w:val="18"/>
               </w:rPr>
-              <w:t xml:space="preserve">3:40</w:t>
+              <w:t xml:space="preserve">3:26</w:t>
             </w:r>
           </w:p>
         </w:tc>
@@ -1655,69 +1655,69 @@
         </w:tc>
         <w:tc>
           <w:tcPr>
-            <w:tcW w:type="dxa" w:w="4260"/>
-            <w:tcBorders>
-              <w:top w:val="single" w:color="BFBFBF" w:sz="1"/>
-              <w:left w:val="single" w:color="BFBFBF" w:sz="1"/>
-              <w:bottom w:val="single" w:color="BFBFBF" w:sz="1"/>
-              <w:right w:val="single" w:color="BFBFBF" w:sz="1"/>
-            </w:tcBorders>
-            <w:tcMar>
-              <w:top w:type="dxa" w:w="60"/>
-              <w:left w:type="dxa" w:w="110"/>
-              <w:bottom w:type="dxa" w:w="60"/>
-              <w:right w:type="dxa" w:w="110"/>
-            </w:tcMar>
-            <w:vAlign w:val="center"/>
-          </w:tcPr>
-          <w:p>
-            <w:pPr>
-              <w:spacing w:after="0"/>
-              <w:jc w:val="center"/>
-            </w:pPr>
-            <w:r>
-              <w:rPr>
-                <w:rFonts w:ascii="Arial" w:cs="Arial" w:eastAsia="Arial" w:hAnsi="Arial"/>
-                <w:b w:val="false"/>
-                <w:bCs w:val="false"/>
-                <w:sz w:val="18"/>
-                <w:szCs w:val="18"/>
-              </w:rPr>
-              <w:t xml:space="preserve">Live demo</w:t>
-            </w:r>
-          </w:p>
-        </w:tc>
-        <w:tc>
-          <w:tcPr>
-            <w:tcW w:type="dxa" w:w="1800"/>
-            <w:tcBorders>
-              <w:top w:val="single" w:color="BFBFBF" w:sz="1"/>
-              <w:left w:val="single" w:color="BFBFBF" w:sz="1"/>
-              <w:bottom w:val="single" w:color="BFBFBF" w:sz="1"/>
-              <w:right w:val="single" w:color="BFBFBF" w:sz="1"/>
-            </w:tcBorders>
-            <w:tcMar>
-              <w:top w:type="dxa" w:w="60"/>
-              <w:left w:type="dxa" w:w="110"/>
-              <w:bottom w:type="dxa" w:w="60"/>
-              <w:right w:type="dxa" w:w="110"/>
-            </w:tcMar>
-            <w:vAlign w:val="center"/>
-          </w:tcPr>
-          <w:p>
-            <w:pPr>
-              <w:spacing w:after="0"/>
-              <w:jc w:val="center"/>
-            </w:pPr>
-            <w:r>
-              <w:rPr>
-                <w:rFonts w:ascii="Arial" w:cs="Arial" w:eastAsia="Arial" w:hAnsi="Arial"/>
-                <w:b w:val="false"/>
-                <w:bCs w:val="false"/>
-                <w:sz w:val="18"/>
-                <w:szCs w:val="18"/>
-              </w:rPr>
-              <w:t xml:space="preserve">1:45</w:t>
+            <w:tcW w:type="dxa" w:w="4560"/>
+            <w:tcBorders>
+              <w:top w:val="single" w:color="BFBFBF" w:sz="1"/>
+              <w:left w:val="single" w:color="BFBFBF" w:sz="1"/>
+              <w:bottom w:val="single" w:color="BFBFBF" w:sz="1"/>
+              <w:right w:val="single" w:color="BFBFBF" w:sz="1"/>
+            </w:tcBorders>
+            <w:tcMar>
+              <w:top w:type="dxa" w:w="60"/>
+              <w:left w:type="dxa" w:w="110"/>
+              <w:bottom w:type="dxa" w:w="60"/>
+              <w:right w:type="dxa" w:w="110"/>
+            </w:tcMar>
+            <w:vAlign w:val="center"/>
+          </w:tcPr>
+          <w:p>
+            <w:pPr>
+              <w:spacing w:after="0"/>
+              <w:jc w:val="center"/>
+            </w:pPr>
+            <w:r>
+              <w:rPr>
+                <w:rFonts w:ascii="Arial" w:cs="Arial" w:eastAsia="Arial" w:hAnsi="Arial"/>
+                <w:b w:val="false"/>
+                <w:bCs w:val="false"/>
+                <w:sz w:val="18"/>
+                <w:szCs w:val="18"/>
+              </w:rPr>
+              <w:t xml:space="preserve">Page Object Model</w:t>
+            </w:r>
+          </w:p>
+        </w:tc>
+        <w:tc>
+          <w:tcPr>
+            <w:tcW w:type="dxa" w:w="1500"/>
+            <w:tcBorders>
+              <w:top w:val="single" w:color="BFBFBF" w:sz="1"/>
+              <w:left w:val="single" w:color="BFBFBF" w:sz="1"/>
+              <w:bottom w:val="single" w:color="BFBFBF" w:sz="1"/>
+              <w:right w:val="single" w:color="BFBFBF" w:sz="1"/>
+            </w:tcBorders>
+            <w:tcMar>
+              <w:top w:type="dxa" w:w="60"/>
+              <w:left w:type="dxa" w:w="110"/>
+              <w:bottom w:type="dxa" w:w="60"/>
+              <w:right w:type="dxa" w:w="110"/>
+            </w:tcMar>
+            <w:vAlign w:val="center"/>
+          </w:tcPr>
+          <w:p>
+            <w:pPr>
+              <w:spacing w:after="0"/>
+              <w:jc w:val="center"/>
+            </w:pPr>
+            <w:r>
+              <w:rPr>
+                <w:rFonts w:ascii="Arial" w:cs="Arial" w:eastAsia="Arial" w:hAnsi="Arial"/>
+                <w:b w:val="false"/>
+                <w:bCs w:val="false"/>
+                <w:sz w:val="18"/>
+                <w:szCs w:val="18"/>
+              </w:rPr>
+              <w:t xml:space="preserve">0:38</w:t>
             </w:r>
           </w:p>
         </w:tc>
@@ -1751,7 +1751,7 @@
                 <w:sz w:val="18"/>
                 <w:szCs w:val="18"/>
               </w:rPr>
-              <w:t xml:space="preserve">5:25</w:t>
+              <w:t xml:space="preserve">4:04</w:t>
             </w:r>
           </w:p>
         </w:tc>
@@ -1794,7 +1794,7 @@
         </w:tc>
         <w:tc>
           <w:tcPr>
-            <w:tcW w:type="dxa" w:w="4260"/>
+            <w:tcW w:type="dxa" w:w="4560"/>
             <w:tcBorders>
               <w:top w:val="single" w:color="BFBFBF" w:sz="1"/>
               <w:left w:val="single" w:color="BFBFBF" w:sz="1"/>
@@ -1823,13 +1823,13 @@
                 <w:sz w:val="18"/>
                 <w:szCs w:val="18"/>
               </w:rPr>
-              <w:t xml:space="preserve">Results</w:t>
-            </w:r>
-          </w:p>
-        </w:tc>
-        <w:tc>
-          <w:tcPr>
-            <w:tcW w:type="dxa" w:w="1800"/>
+              <w:t xml:space="preserve">Test coverage</w:t>
+            </w:r>
+          </w:p>
+        </w:tc>
+        <w:tc>
+          <w:tcPr>
+            <w:tcW w:type="dxa" w:w="1500"/>
             <w:tcBorders>
               <w:top w:val="single" w:color="BFBFBF" w:sz="1"/>
               <w:left w:val="single" w:color="BFBFBF" w:sz="1"/>
@@ -1858,7 +1858,7 @@
                 <w:sz w:val="18"/>
                 <w:szCs w:val="18"/>
               </w:rPr>
-              <w:t xml:space="preserve">0:35</w:t>
+              <w:t xml:space="preserve">0:32</w:t>
             </w:r>
           </w:p>
         </w:tc>
@@ -1893,7 +1893,7 @@
                 <w:sz w:val="18"/>
                 <w:szCs w:val="18"/>
               </w:rPr>
-              <w:t xml:space="preserve">6:00</w:t>
+              <w:t xml:space="preserve">4:36</w:t>
             </w:r>
           </w:p>
         </w:tc>
@@ -1935,69 +1935,69 @@
         </w:tc>
         <w:tc>
           <w:tcPr>
-            <w:tcW w:type="dxa" w:w="4260"/>
-            <w:tcBorders>
-              <w:top w:val="single" w:color="BFBFBF" w:sz="1"/>
-              <w:left w:val="single" w:color="BFBFBF" w:sz="1"/>
-              <w:bottom w:val="single" w:color="BFBFBF" w:sz="1"/>
-              <w:right w:val="single" w:color="BFBFBF" w:sz="1"/>
-            </w:tcBorders>
-            <w:tcMar>
-              <w:top w:type="dxa" w:w="60"/>
-              <w:left w:type="dxa" w:w="110"/>
-              <w:bottom w:type="dxa" w:w="60"/>
-              <w:right w:type="dxa" w:w="110"/>
-            </w:tcMar>
-            <w:vAlign w:val="center"/>
-          </w:tcPr>
-          <w:p>
-            <w:pPr>
-              <w:spacing w:after="0"/>
-              <w:jc w:val="center"/>
-            </w:pPr>
-            <w:r>
-              <w:rPr>
-                <w:rFonts w:ascii="Arial" w:cs="Arial" w:eastAsia="Arial" w:hAnsi="Arial"/>
-                <w:b w:val="false"/>
-                <w:bCs w:val="false"/>
-                <w:sz w:val="18"/>
-                <w:szCs w:val="18"/>
-              </w:rPr>
-              <w:t xml:space="preserve">Security finding</w:t>
-            </w:r>
-          </w:p>
-        </w:tc>
-        <w:tc>
-          <w:tcPr>
-            <w:tcW w:type="dxa" w:w="1800"/>
-            <w:tcBorders>
-              <w:top w:val="single" w:color="BFBFBF" w:sz="1"/>
-              <w:left w:val="single" w:color="BFBFBF" w:sz="1"/>
-              <w:bottom w:val="single" w:color="BFBFBF" w:sz="1"/>
-              <w:right w:val="single" w:color="BFBFBF" w:sz="1"/>
-            </w:tcBorders>
-            <w:tcMar>
-              <w:top w:type="dxa" w:w="60"/>
-              <w:left w:type="dxa" w:w="110"/>
-              <w:bottom w:type="dxa" w:w="60"/>
-              <w:right w:type="dxa" w:w="110"/>
-            </w:tcMar>
-            <w:vAlign w:val="center"/>
-          </w:tcPr>
-          <w:p>
-            <w:pPr>
-              <w:spacing w:after="0"/>
-              <w:jc w:val="center"/>
-            </w:pPr>
-            <w:r>
-              <w:rPr>
-                <w:rFonts w:ascii="Arial" w:cs="Arial" w:eastAsia="Arial" w:hAnsi="Arial"/>
-                <w:b w:val="false"/>
-                <w:bCs w:val="false"/>
-                <w:sz w:val="18"/>
-                <w:szCs w:val="18"/>
-              </w:rPr>
-              <w:t xml:space="preserve">0:45</w:t>
+            <w:tcW w:type="dxa" w:w="4560"/>
+            <w:tcBorders>
+              <w:top w:val="single" w:color="BFBFBF" w:sz="1"/>
+              <w:left w:val="single" w:color="BFBFBF" w:sz="1"/>
+              <w:bottom w:val="single" w:color="BFBFBF" w:sz="1"/>
+              <w:right w:val="single" w:color="BFBFBF" w:sz="1"/>
+            </w:tcBorders>
+            <w:tcMar>
+              <w:top w:type="dxa" w:w="60"/>
+              <w:left w:type="dxa" w:w="110"/>
+              <w:bottom w:type="dxa" w:w="60"/>
+              <w:right w:type="dxa" w:w="110"/>
+            </w:tcMar>
+            <w:vAlign w:val="center"/>
+          </w:tcPr>
+          <w:p>
+            <w:pPr>
+              <w:spacing w:after="0"/>
+              <w:jc w:val="center"/>
+            </w:pPr>
+            <w:r>
+              <w:rPr>
+                <w:rFonts w:ascii="Arial" w:cs="Arial" w:eastAsia="Arial" w:hAnsi="Arial"/>
+                <w:b w:val="false"/>
+                <w:bCs w:val="false"/>
+                <w:sz w:val="18"/>
+                <w:szCs w:val="18"/>
+              </w:rPr>
+              <w:t xml:space="preserve">Deep testing - boundary</w:t>
+            </w:r>
+          </w:p>
+        </w:tc>
+        <w:tc>
+          <w:tcPr>
+            <w:tcW w:type="dxa" w:w="1500"/>
+            <w:tcBorders>
+              <w:top w:val="single" w:color="BFBFBF" w:sz="1"/>
+              <w:left w:val="single" w:color="BFBFBF" w:sz="1"/>
+              <w:bottom w:val="single" w:color="BFBFBF" w:sz="1"/>
+              <w:right w:val="single" w:color="BFBFBF" w:sz="1"/>
+            </w:tcBorders>
+            <w:tcMar>
+              <w:top w:type="dxa" w:w="60"/>
+              <w:left w:type="dxa" w:w="110"/>
+              <w:bottom w:type="dxa" w:w="60"/>
+              <w:right w:type="dxa" w:w="110"/>
+            </w:tcMar>
+            <w:vAlign w:val="center"/>
+          </w:tcPr>
+          <w:p>
+            <w:pPr>
+              <w:spacing w:after="0"/>
+              <w:jc w:val="center"/>
+            </w:pPr>
+            <w:r>
+              <w:rPr>
+                <w:rFonts w:ascii="Arial" w:cs="Arial" w:eastAsia="Arial" w:hAnsi="Arial"/>
+                <w:b w:val="false"/>
+                <w:bCs w:val="false"/>
+                <w:sz w:val="18"/>
+                <w:szCs w:val="18"/>
+              </w:rPr>
+              <w:t xml:space="preserve">0:40</w:t>
             </w:r>
           </w:p>
         </w:tc>
@@ -2031,7 +2031,7 @@
                 <w:sz w:val="18"/>
                 <w:szCs w:val="18"/>
               </w:rPr>
-              <w:t xml:space="preserve">6:45</w:t>
+              <w:t xml:space="preserve">5:16</w:t>
             </w:r>
           </w:p>
         </w:tc>
@@ -2074,7 +2074,7 @@
         </w:tc>
         <w:tc>
           <w:tcPr>
-            <w:tcW w:type="dxa" w:w="4260"/>
+            <w:tcW w:type="dxa" w:w="4560"/>
             <w:tcBorders>
               <w:top w:val="single" w:color="BFBFBF" w:sz="1"/>
               <w:left w:val="single" w:color="BFBFBF" w:sz="1"/>
@@ -2103,13 +2103,13 @@
                 <w:sz w:val="18"/>
                 <w:szCs w:val="18"/>
               </w:rPr>
-              <w:t xml:space="preserve">Deliverables</w:t>
-            </w:r>
-          </w:p>
-        </w:tc>
-        <w:tc>
-          <w:tcPr>
-            <w:tcW w:type="dxa" w:w="1800"/>
+              <w:t xml:space="preserve">Deep testing - security</w:t>
+            </w:r>
+          </w:p>
+        </w:tc>
+        <w:tc>
+          <w:tcPr>
+            <w:tcW w:type="dxa" w:w="1500"/>
             <w:tcBorders>
               <w:top w:val="single" w:color="BFBFBF" w:sz="1"/>
               <w:left w:val="single" w:color="BFBFBF" w:sz="1"/>
@@ -2138,7 +2138,7 @@
                 <w:sz w:val="18"/>
                 <w:szCs w:val="18"/>
               </w:rPr>
-              <w:t xml:space="preserve">0:25</w:t>
+              <w:t xml:space="preserve">0:45</w:t>
             </w:r>
           </w:p>
         </w:tc>
@@ -2173,7 +2173,7 @@
                 <w:sz w:val="18"/>
                 <w:szCs w:val="18"/>
               </w:rPr>
-              <w:t xml:space="preserve">7:10</w:t>
+              <w:t xml:space="preserve">6:01</w:t>
             </w:r>
           </w:p>
         </w:tc>
@@ -2215,7 +2215,847 @@
         </w:tc>
         <w:tc>
           <w:tcPr>
-            <w:tcW w:type="dxa" w:w="4260"/>
+            <w:tcW w:type="dxa" w:w="4560"/>
+            <w:tcBorders>
+              <w:top w:val="single" w:color="BFBFBF" w:sz="1"/>
+              <w:left w:val="single" w:color="BFBFBF" w:sz="1"/>
+              <w:bottom w:val="single" w:color="BFBFBF" w:sz="1"/>
+              <w:right w:val="single" w:color="BFBFBF" w:sz="1"/>
+            </w:tcBorders>
+            <w:tcMar>
+              <w:top w:type="dxa" w:w="60"/>
+              <w:left w:type="dxa" w:w="110"/>
+              <w:bottom w:type="dxa" w:w="60"/>
+              <w:right w:type="dxa" w:w="110"/>
+            </w:tcMar>
+            <w:vAlign w:val="center"/>
+          </w:tcPr>
+          <w:p>
+            <w:pPr>
+              <w:spacing w:after="0"/>
+              <w:jc w:val="center"/>
+            </w:pPr>
+            <w:r>
+              <w:rPr>
+                <w:rFonts w:ascii="Arial" w:cs="Arial" w:eastAsia="Arial" w:hAnsi="Arial"/>
+                <w:b w:val="false"/>
+                <w:bCs w:val="false"/>
+                <w:sz w:val="18"/>
+                <w:szCs w:val="18"/>
+              </w:rPr>
+              <w:t xml:space="preserve">Deep testing - access &amp; performance</w:t>
+            </w:r>
+          </w:p>
+        </w:tc>
+        <w:tc>
+          <w:tcPr>
+            <w:tcW w:type="dxa" w:w="1500"/>
+            <w:tcBorders>
+              <w:top w:val="single" w:color="BFBFBF" w:sz="1"/>
+              <w:left w:val="single" w:color="BFBFBF" w:sz="1"/>
+              <w:bottom w:val="single" w:color="BFBFBF" w:sz="1"/>
+              <w:right w:val="single" w:color="BFBFBF" w:sz="1"/>
+            </w:tcBorders>
+            <w:tcMar>
+              <w:top w:type="dxa" w:w="60"/>
+              <w:left w:type="dxa" w:w="110"/>
+              <w:bottom w:type="dxa" w:w="60"/>
+              <w:right w:type="dxa" w:w="110"/>
+            </w:tcMar>
+            <w:vAlign w:val="center"/>
+          </w:tcPr>
+          <w:p>
+            <w:pPr>
+              <w:spacing w:after="0"/>
+              <w:jc w:val="center"/>
+            </w:pPr>
+            <w:r>
+              <w:rPr>
+                <w:rFonts w:ascii="Arial" w:cs="Arial" w:eastAsia="Arial" w:hAnsi="Arial"/>
+                <w:b w:val="false"/>
+                <w:bCs w:val="false"/>
+                <w:sz w:val="18"/>
+                <w:szCs w:val="18"/>
+              </w:rPr>
+              <w:t xml:space="preserve">0:42</w:t>
+            </w:r>
+          </w:p>
+        </w:tc>
+        <w:tc>
+          <w:tcPr>
+            <w:tcW w:type="dxa" w:w="2400"/>
+            <w:tcBorders>
+              <w:top w:val="single" w:color="BFBFBF" w:sz="1"/>
+              <w:left w:val="single" w:color="BFBFBF" w:sz="1"/>
+              <w:bottom w:val="single" w:color="BFBFBF" w:sz="1"/>
+              <w:right w:val="single" w:color="BFBFBF" w:sz="1"/>
+            </w:tcBorders>
+            <w:tcMar>
+              <w:top w:type="dxa" w:w="60"/>
+              <w:left w:type="dxa" w:w="110"/>
+              <w:bottom w:type="dxa" w:w="60"/>
+              <w:right w:type="dxa" w:w="110"/>
+            </w:tcMar>
+            <w:vAlign w:val="center"/>
+          </w:tcPr>
+          <w:p>
+            <w:pPr>
+              <w:spacing w:after="0"/>
+              <w:jc w:val="center"/>
+            </w:pPr>
+            <w:r>
+              <w:rPr>
+                <w:rFonts w:ascii="Arial" w:cs="Arial" w:eastAsia="Arial" w:hAnsi="Arial"/>
+                <w:b w:val="false"/>
+                <w:bCs w:val="false"/>
+                <w:sz w:val="18"/>
+                <w:szCs w:val="18"/>
+              </w:rPr>
+              <w:t xml:space="preserve">6:43</w:t>
+            </w:r>
+          </w:p>
+        </w:tc>
+      </w:tr>
+      <w:tr>
+        <w:tc>
+          <w:tcPr>
+            <w:tcW w:type="dxa" w:w="900"/>
+            <w:tcBorders>
+              <w:top w:val="single" w:color="BFBFBF" w:sz="1"/>
+              <w:left w:val="single" w:color="BFBFBF" w:sz="1"/>
+              <w:bottom w:val="single" w:color="BFBFBF" w:sz="1"/>
+              <w:right w:val="single" w:color="BFBFBF" w:sz="1"/>
+            </w:tcBorders>
+            <w:shd w:fill="F4F6FB" w:val="clear"/>
+            <w:tcMar>
+              <w:top w:type="dxa" w:w="60"/>
+              <w:left w:type="dxa" w:w="110"/>
+              <w:bottom w:type="dxa" w:w="60"/>
+              <w:right w:type="dxa" w:w="110"/>
+            </w:tcMar>
+            <w:vAlign w:val="center"/>
+          </w:tcPr>
+          <w:p>
+            <w:pPr>
+              <w:spacing w:after="0"/>
+              <w:jc w:val="left"/>
+            </w:pPr>
+            <w:r>
+              <w:rPr>
+                <w:rFonts w:ascii="Arial" w:cs="Arial" w:eastAsia="Arial" w:hAnsi="Arial"/>
+                <w:b/>
+                <w:bCs/>
+                <w:sz w:val="18"/>
+                <w:szCs w:val="18"/>
+              </w:rPr>
+              <w:t xml:space="preserve">12</w:t>
+            </w:r>
+          </w:p>
+        </w:tc>
+        <w:tc>
+          <w:tcPr>
+            <w:tcW w:type="dxa" w:w="4560"/>
+            <w:tcBorders>
+              <w:top w:val="single" w:color="BFBFBF" w:sz="1"/>
+              <w:left w:val="single" w:color="BFBFBF" w:sz="1"/>
+              <w:bottom w:val="single" w:color="BFBFBF" w:sz="1"/>
+              <w:right w:val="single" w:color="BFBFBF" w:sz="1"/>
+            </w:tcBorders>
+            <w:shd w:fill="F4F6FB" w:val="clear"/>
+            <w:tcMar>
+              <w:top w:type="dxa" w:w="60"/>
+              <w:left w:type="dxa" w:w="110"/>
+              <w:bottom w:type="dxa" w:w="60"/>
+              <w:right w:type="dxa" w:w="110"/>
+            </w:tcMar>
+            <w:vAlign w:val="center"/>
+          </w:tcPr>
+          <w:p>
+            <w:pPr>
+              <w:spacing w:after="0"/>
+              <w:jc w:val="center"/>
+            </w:pPr>
+            <w:r>
+              <w:rPr>
+                <w:rFonts w:ascii="Arial" w:cs="Arial" w:eastAsia="Arial" w:hAnsi="Arial"/>
+                <w:b w:val="false"/>
+                <w:bCs w:val="false"/>
+                <w:sz w:val="18"/>
+                <w:szCs w:val="18"/>
+              </w:rPr>
+              <w:t xml:space="preserve">Live demo</w:t>
+            </w:r>
+          </w:p>
+        </w:tc>
+        <w:tc>
+          <w:tcPr>
+            <w:tcW w:type="dxa" w:w="1500"/>
+            <w:tcBorders>
+              <w:top w:val="single" w:color="BFBFBF" w:sz="1"/>
+              <w:left w:val="single" w:color="BFBFBF" w:sz="1"/>
+              <w:bottom w:val="single" w:color="BFBFBF" w:sz="1"/>
+              <w:right w:val="single" w:color="BFBFBF" w:sz="1"/>
+            </w:tcBorders>
+            <w:shd w:fill="F4F6FB" w:val="clear"/>
+            <w:tcMar>
+              <w:top w:type="dxa" w:w="60"/>
+              <w:left w:type="dxa" w:w="110"/>
+              <w:bottom w:type="dxa" w:w="60"/>
+              <w:right w:type="dxa" w:w="110"/>
+            </w:tcMar>
+            <w:vAlign w:val="center"/>
+          </w:tcPr>
+          <w:p>
+            <w:pPr>
+              <w:spacing w:after="0"/>
+              <w:jc w:val="center"/>
+            </w:pPr>
+            <w:r>
+              <w:rPr>
+                <w:rFonts w:ascii="Arial" w:cs="Arial" w:eastAsia="Arial" w:hAnsi="Arial"/>
+                <w:b w:val="false"/>
+                <w:bCs w:val="false"/>
+                <w:sz w:val="18"/>
+                <w:szCs w:val="18"/>
+              </w:rPr>
+              <w:t xml:space="preserve">2:30</w:t>
+            </w:r>
+          </w:p>
+        </w:tc>
+        <w:tc>
+          <w:tcPr>
+            <w:tcW w:type="dxa" w:w="2400"/>
+            <w:tcBorders>
+              <w:top w:val="single" w:color="BFBFBF" w:sz="1"/>
+              <w:left w:val="single" w:color="BFBFBF" w:sz="1"/>
+              <w:bottom w:val="single" w:color="BFBFBF" w:sz="1"/>
+              <w:right w:val="single" w:color="BFBFBF" w:sz="1"/>
+            </w:tcBorders>
+            <w:shd w:fill="F4F6FB" w:val="clear"/>
+            <w:tcMar>
+              <w:top w:type="dxa" w:w="60"/>
+              <w:left w:type="dxa" w:w="110"/>
+              <w:bottom w:type="dxa" w:w="60"/>
+              <w:right w:type="dxa" w:w="110"/>
+            </w:tcMar>
+            <w:vAlign w:val="center"/>
+          </w:tcPr>
+          <w:p>
+            <w:pPr>
+              <w:spacing w:after="0"/>
+              <w:jc w:val="center"/>
+            </w:pPr>
+            <w:r>
+              <w:rPr>
+                <w:rFonts w:ascii="Arial" w:cs="Arial" w:eastAsia="Arial" w:hAnsi="Arial"/>
+                <w:b w:val="false"/>
+                <w:bCs w:val="false"/>
+                <w:sz w:val="18"/>
+                <w:szCs w:val="18"/>
+              </w:rPr>
+              <w:t xml:space="preserve">9:13</w:t>
+            </w:r>
+          </w:p>
+        </w:tc>
+      </w:tr>
+      <w:tr>
+        <w:tc>
+          <w:tcPr>
+            <w:tcW w:type="dxa" w:w="900"/>
+            <w:tcBorders>
+              <w:top w:val="single" w:color="BFBFBF" w:sz="1"/>
+              <w:left w:val="single" w:color="BFBFBF" w:sz="1"/>
+              <w:bottom w:val="single" w:color="BFBFBF" w:sz="1"/>
+              <w:right w:val="single" w:color="BFBFBF" w:sz="1"/>
+            </w:tcBorders>
+            <w:tcMar>
+              <w:top w:type="dxa" w:w="60"/>
+              <w:left w:type="dxa" w:w="110"/>
+              <w:bottom w:type="dxa" w:w="60"/>
+              <w:right w:type="dxa" w:w="110"/>
+            </w:tcMar>
+            <w:vAlign w:val="center"/>
+          </w:tcPr>
+          <w:p>
+            <w:pPr>
+              <w:spacing w:after="0"/>
+              <w:jc w:val="left"/>
+            </w:pPr>
+            <w:r>
+              <w:rPr>
+                <w:rFonts w:ascii="Arial" w:cs="Arial" w:eastAsia="Arial" w:hAnsi="Arial"/>
+                <w:b/>
+                <w:bCs/>
+                <w:sz w:val="18"/>
+                <w:szCs w:val="18"/>
+              </w:rPr>
+              <w:t xml:space="preserve">13</w:t>
+            </w:r>
+          </w:p>
+        </w:tc>
+        <w:tc>
+          <w:tcPr>
+            <w:tcW w:type="dxa" w:w="4560"/>
+            <w:tcBorders>
+              <w:top w:val="single" w:color="BFBFBF" w:sz="1"/>
+              <w:left w:val="single" w:color="BFBFBF" w:sz="1"/>
+              <w:bottom w:val="single" w:color="BFBFBF" w:sz="1"/>
+              <w:right w:val="single" w:color="BFBFBF" w:sz="1"/>
+            </w:tcBorders>
+            <w:tcMar>
+              <w:top w:type="dxa" w:w="60"/>
+              <w:left w:type="dxa" w:w="110"/>
+              <w:bottom w:type="dxa" w:w="60"/>
+              <w:right w:type="dxa" w:w="110"/>
+            </w:tcMar>
+            <w:vAlign w:val="center"/>
+          </w:tcPr>
+          <w:p>
+            <w:pPr>
+              <w:spacing w:after="0"/>
+              <w:jc w:val="center"/>
+            </w:pPr>
+            <w:r>
+              <w:rPr>
+                <w:rFonts w:ascii="Arial" w:cs="Arial" w:eastAsia="Arial" w:hAnsi="Arial"/>
+                <w:b w:val="false"/>
+                <w:bCs w:val="false"/>
+                <w:sz w:val="18"/>
+                <w:szCs w:val="18"/>
+              </w:rPr>
+              <w:t xml:space="preserve">Results</w:t>
+            </w:r>
+          </w:p>
+        </w:tc>
+        <w:tc>
+          <w:tcPr>
+            <w:tcW w:type="dxa" w:w="1500"/>
+            <w:tcBorders>
+              <w:top w:val="single" w:color="BFBFBF" w:sz="1"/>
+              <w:left w:val="single" w:color="BFBFBF" w:sz="1"/>
+              <w:bottom w:val="single" w:color="BFBFBF" w:sz="1"/>
+              <w:right w:val="single" w:color="BFBFBF" w:sz="1"/>
+            </w:tcBorders>
+            <w:tcMar>
+              <w:top w:type="dxa" w:w="60"/>
+              <w:left w:type="dxa" w:w="110"/>
+              <w:bottom w:type="dxa" w:w="60"/>
+              <w:right w:type="dxa" w:w="110"/>
+            </w:tcMar>
+            <w:vAlign w:val="center"/>
+          </w:tcPr>
+          <w:p>
+            <w:pPr>
+              <w:spacing w:after="0"/>
+              <w:jc w:val="center"/>
+            </w:pPr>
+            <w:r>
+              <w:rPr>
+                <w:rFonts w:ascii="Arial" w:cs="Arial" w:eastAsia="Arial" w:hAnsi="Arial"/>
+                <w:b w:val="false"/>
+                <w:bCs w:val="false"/>
+                <w:sz w:val="18"/>
+                <w:szCs w:val="18"/>
+              </w:rPr>
+              <w:t xml:space="preserve">0:32</w:t>
+            </w:r>
+          </w:p>
+        </w:tc>
+        <w:tc>
+          <w:tcPr>
+            <w:tcW w:type="dxa" w:w="2400"/>
+            <w:tcBorders>
+              <w:top w:val="single" w:color="BFBFBF" w:sz="1"/>
+              <w:left w:val="single" w:color="BFBFBF" w:sz="1"/>
+              <w:bottom w:val="single" w:color="BFBFBF" w:sz="1"/>
+              <w:right w:val="single" w:color="BFBFBF" w:sz="1"/>
+            </w:tcBorders>
+            <w:tcMar>
+              <w:top w:type="dxa" w:w="60"/>
+              <w:left w:type="dxa" w:w="110"/>
+              <w:bottom w:type="dxa" w:w="60"/>
+              <w:right w:type="dxa" w:w="110"/>
+            </w:tcMar>
+            <w:vAlign w:val="center"/>
+          </w:tcPr>
+          <w:p>
+            <w:pPr>
+              <w:spacing w:after="0"/>
+              <w:jc w:val="center"/>
+            </w:pPr>
+            <w:r>
+              <w:rPr>
+                <w:rFonts w:ascii="Arial" w:cs="Arial" w:eastAsia="Arial" w:hAnsi="Arial"/>
+                <w:b w:val="false"/>
+                <w:bCs w:val="false"/>
+                <w:sz w:val="18"/>
+                <w:szCs w:val="18"/>
+              </w:rPr>
+              <w:t xml:space="preserve">9:45</w:t>
+            </w:r>
+          </w:p>
+        </w:tc>
+      </w:tr>
+      <w:tr>
+        <w:tc>
+          <w:tcPr>
+            <w:tcW w:type="dxa" w:w="900"/>
+            <w:tcBorders>
+              <w:top w:val="single" w:color="BFBFBF" w:sz="1"/>
+              <w:left w:val="single" w:color="BFBFBF" w:sz="1"/>
+              <w:bottom w:val="single" w:color="BFBFBF" w:sz="1"/>
+              <w:right w:val="single" w:color="BFBFBF" w:sz="1"/>
+            </w:tcBorders>
+            <w:shd w:fill="F4F6FB" w:val="clear"/>
+            <w:tcMar>
+              <w:top w:type="dxa" w:w="60"/>
+              <w:left w:type="dxa" w:w="110"/>
+              <w:bottom w:type="dxa" w:w="60"/>
+              <w:right w:type="dxa" w:w="110"/>
+            </w:tcMar>
+            <w:vAlign w:val="center"/>
+          </w:tcPr>
+          <w:p>
+            <w:pPr>
+              <w:spacing w:after="0"/>
+              <w:jc w:val="left"/>
+            </w:pPr>
+            <w:r>
+              <w:rPr>
+                <w:rFonts w:ascii="Arial" w:cs="Arial" w:eastAsia="Arial" w:hAnsi="Arial"/>
+                <w:b/>
+                <w:bCs/>
+                <w:sz w:val="18"/>
+                <w:szCs w:val="18"/>
+              </w:rPr>
+              <w:t xml:space="preserve">14</w:t>
+            </w:r>
+          </w:p>
+        </w:tc>
+        <w:tc>
+          <w:tcPr>
+            <w:tcW w:type="dxa" w:w="4560"/>
+            <w:tcBorders>
+              <w:top w:val="single" w:color="BFBFBF" w:sz="1"/>
+              <w:left w:val="single" w:color="BFBFBF" w:sz="1"/>
+              <w:bottom w:val="single" w:color="BFBFBF" w:sz="1"/>
+              <w:right w:val="single" w:color="BFBFBF" w:sz="1"/>
+            </w:tcBorders>
+            <w:shd w:fill="F4F6FB" w:val="clear"/>
+            <w:tcMar>
+              <w:top w:type="dxa" w:w="60"/>
+              <w:left w:type="dxa" w:w="110"/>
+              <w:bottom w:type="dxa" w:w="60"/>
+              <w:right w:type="dxa" w:w="110"/>
+            </w:tcMar>
+            <w:vAlign w:val="center"/>
+          </w:tcPr>
+          <w:p>
+            <w:pPr>
+              <w:spacing w:after="0"/>
+              <w:jc w:val="center"/>
+            </w:pPr>
+            <w:r>
+              <w:rPr>
+                <w:rFonts w:ascii="Arial" w:cs="Arial" w:eastAsia="Arial" w:hAnsi="Arial"/>
+                <w:b w:val="false"/>
+                <w:bCs w:val="false"/>
+                <w:sz w:val="18"/>
+                <w:szCs w:val="18"/>
+              </w:rPr>
+              <w:t xml:space="preserve">Reporting &amp; evidence</w:t>
+            </w:r>
+          </w:p>
+        </w:tc>
+        <w:tc>
+          <w:tcPr>
+            <w:tcW w:type="dxa" w:w="1500"/>
+            <w:tcBorders>
+              <w:top w:val="single" w:color="BFBFBF" w:sz="1"/>
+              <w:left w:val="single" w:color="BFBFBF" w:sz="1"/>
+              <w:bottom w:val="single" w:color="BFBFBF" w:sz="1"/>
+              <w:right w:val="single" w:color="BFBFBF" w:sz="1"/>
+            </w:tcBorders>
+            <w:shd w:fill="F4F6FB" w:val="clear"/>
+            <w:tcMar>
+              <w:top w:type="dxa" w:w="60"/>
+              <w:left w:type="dxa" w:w="110"/>
+              <w:bottom w:type="dxa" w:w="60"/>
+              <w:right w:type="dxa" w:w="110"/>
+            </w:tcMar>
+            <w:vAlign w:val="center"/>
+          </w:tcPr>
+          <w:p>
+            <w:pPr>
+              <w:spacing w:after="0"/>
+              <w:jc w:val="center"/>
+            </w:pPr>
+            <w:r>
+              <w:rPr>
+                <w:rFonts w:ascii="Arial" w:cs="Arial" w:eastAsia="Arial" w:hAnsi="Arial"/>
+                <w:b w:val="false"/>
+                <w:bCs w:val="false"/>
+                <w:sz w:val="18"/>
+                <w:szCs w:val="18"/>
+              </w:rPr>
+              <w:t xml:space="preserve">0:35</w:t>
+            </w:r>
+          </w:p>
+        </w:tc>
+        <w:tc>
+          <w:tcPr>
+            <w:tcW w:type="dxa" w:w="2400"/>
+            <w:tcBorders>
+              <w:top w:val="single" w:color="BFBFBF" w:sz="1"/>
+              <w:left w:val="single" w:color="BFBFBF" w:sz="1"/>
+              <w:bottom w:val="single" w:color="BFBFBF" w:sz="1"/>
+              <w:right w:val="single" w:color="BFBFBF" w:sz="1"/>
+            </w:tcBorders>
+            <w:shd w:fill="F4F6FB" w:val="clear"/>
+            <w:tcMar>
+              <w:top w:type="dxa" w:w="60"/>
+              <w:left w:type="dxa" w:w="110"/>
+              <w:bottom w:type="dxa" w:w="60"/>
+              <w:right w:type="dxa" w:w="110"/>
+            </w:tcMar>
+            <w:vAlign w:val="center"/>
+          </w:tcPr>
+          <w:p>
+            <w:pPr>
+              <w:spacing w:after="0"/>
+              <w:jc w:val="center"/>
+            </w:pPr>
+            <w:r>
+              <w:rPr>
+                <w:rFonts w:ascii="Arial" w:cs="Arial" w:eastAsia="Arial" w:hAnsi="Arial"/>
+                <w:b w:val="false"/>
+                <w:bCs w:val="false"/>
+                <w:sz w:val="18"/>
+                <w:szCs w:val="18"/>
+              </w:rPr>
+              <w:t xml:space="preserve">10:20</w:t>
+            </w:r>
+          </w:p>
+        </w:tc>
+      </w:tr>
+      <w:tr>
+        <w:tc>
+          <w:tcPr>
+            <w:tcW w:type="dxa" w:w="900"/>
+            <w:tcBorders>
+              <w:top w:val="single" w:color="BFBFBF" w:sz="1"/>
+              <w:left w:val="single" w:color="BFBFBF" w:sz="1"/>
+              <w:bottom w:val="single" w:color="BFBFBF" w:sz="1"/>
+              <w:right w:val="single" w:color="BFBFBF" w:sz="1"/>
+            </w:tcBorders>
+            <w:tcMar>
+              <w:top w:type="dxa" w:w="60"/>
+              <w:left w:type="dxa" w:w="110"/>
+              <w:bottom w:type="dxa" w:w="60"/>
+              <w:right w:type="dxa" w:w="110"/>
+            </w:tcMar>
+            <w:vAlign w:val="center"/>
+          </w:tcPr>
+          <w:p>
+            <w:pPr>
+              <w:spacing w:after="0"/>
+              <w:jc w:val="left"/>
+            </w:pPr>
+            <w:r>
+              <w:rPr>
+                <w:rFonts w:ascii="Arial" w:cs="Arial" w:eastAsia="Arial" w:hAnsi="Arial"/>
+                <w:b/>
+                <w:bCs/>
+                <w:sz w:val="18"/>
+                <w:szCs w:val="18"/>
+              </w:rPr>
+              <w:t xml:space="preserve">15</w:t>
+            </w:r>
+          </w:p>
+        </w:tc>
+        <w:tc>
+          <w:tcPr>
+            <w:tcW w:type="dxa" w:w="4560"/>
+            <w:tcBorders>
+              <w:top w:val="single" w:color="BFBFBF" w:sz="1"/>
+              <w:left w:val="single" w:color="BFBFBF" w:sz="1"/>
+              <w:bottom w:val="single" w:color="BFBFBF" w:sz="1"/>
+              <w:right w:val="single" w:color="BFBFBF" w:sz="1"/>
+            </w:tcBorders>
+            <w:tcMar>
+              <w:top w:type="dxa" w:w="60"/>
+              <w:left w:type="dxa" w:w="110"/>
+              <w:bottom w:type="dxa" w:w="60"/>
+              <w:right w:type="dxa" w:w="110"/>
+            </w:tcMar>
+            <w:vAlign w:val="center"/>
+          </w:tcPr>
+          <w:p>
+            <w:pPr>
+              <w:spacing w:after="0"/>
+              <w:jc w:val="center"/>
+            </w:pPr>
+            <w:r>
+              <w:rPr>
+                <w:rFonts w:ascii="Arial" w:cs="Arial" w:eastAsia="Arial" w:hAnsi="Arial"/>
+                <w:b w:val="false"/>
+                <w:bCs w:val="false"/>
+                <w:sz w:val="18"/>
+                <w:szCs w:val="18"/>
+              </w:rPr>
+              <w:t xml:space="preserve">Security finding</w:t>
+            </w:r>
+          </w:p>
+        </w:tc>
+        <w:tc>
+          <w:tcPr>
+            <w:tcW w:type="dxa" w:w="1500"/>
+            <w:tcBorders>
+              <w:top w:val="single" w:color="BFBFBF" w:sz="1"/>
+              <w:left w:val="single" w:color="BFBFBF" w:sz="1"/>
+              <w:bottom w:val="single" w:color="BFBFBF" w:sz="1"/>
+              <w:right w:val="single" w:color="BFBFBF" w:sz="1"/>
+            </w:tcBorders>
+            <w:tcMar>
+              <w:top w:type="dxa" w:w="60"/>
+              <w:left w:type="dxa" w:w="110"/>
+              <w:bottom w:type="dxa" w:w="60"/>
+              <w:right w:type="dxa" w:w="110"/>
+            </w:tcMar>
+            <w:vAlign w:val="center"/>
+          </w:tcPr>
+          <w:p>
+            <w:pPr>
+              <w:spacing w:after="0"/>
+              <w:jc w:val="center"/>
+            </w:pPr>
+            <w:r>
+              <w:rPr>
+                <w:rFonts w:ascii="Arial" w:cs="Arial" w:eastAsia="Arial" w:hAnsi="Arial"/>
+                <w:b w:val="false"/>
+                <w:bCs w:val="false"/>
+                <w:sz w:val="18"/>
+                <w:szCs w:val="18"/>
+              </w:rPr>
+              <w:t xml:space="preserve">0:42</w:t>
+            </w:r>
+          </w:p>
+        </w:tc>
+        <w:tc>
+          <w:tcPr>
+            <w:tcW w:type="dxa" w:w="2400"/>
+            <w:tcBorders>
+              <w:top w:val="single" w:color="BFBFBF" w:sz="1"/>
+              <w:left w:val="single" w:color="BFBFBF" w:sz="1"/>
+              <w:bottom w:val="single" w:color="BFBFBF" w:sz="1"/>
+              <w:right w:val="single" w:color="BFBFBF" w:sz="1"/>
+            </w:tcBorders>
+            <w:tcMar>
+              <w:top w:type="dxa" w:w="60"/>
+              <w:left w:type="dxa" w:w="110"/>
+              <w:bottom w:type="dxa" w:w="60"/>
+              <w:right w:type="dxa" w:w="110"/>
+            </w:tcMar>
+            <w:vAlign w:val="center"/>
+          </w:tcPr>
+          <w:p>
+            <w:pPr>
+              <w:spacing w:after="0"/>
+              <w:jc w:val="center"/>
+            </w:pPr>
+            <w:r>
+              <w:rPr>
+                <w:rFonts w:ascii="Arial" w:cs="Arial" w:eastAsia="Arial" w:hAnsi="Arial"/>
+                <w:b w:val="false"/>
+                <w:bCs w:val="false"/>
+                <w:sz w:val="18"/>
+                <w:szCs w:val="18"/>
+              </w:rPr>
+              <w:t xml:space="preserve">11:02</w:t>
+            </w:r>
+          </w:p>
+        </w:tc>
+      </w:tr>
+      <w:tr>
+        <w:tc>
+          <w:tcPr>
+            <w:tcW w:type="dxa" w:w="900"/>
+            <w:tcBorders>
+              <w:top w:val="single" w:color="BFBFBF" w:sz="1"/>
+              <w:left w:val="single" w:color="BFBFBF" w:sz="1"/>
+              <w:bottom w:val="single" w:color="BFBFBF" w:sz="1"/>
+              <w:right w:val="single" w:color="BFBFBF" w:sz="1"/>
+            </w:tcBorders>
+            <w:shd w:fill="F4F6FB" w:val="clear"/>
+            <w:tcMar>
+              <w:top w:type="dxa" w:w="60"/>
+              <w:left w:type="dxa" w:w="110"/>
+              <w:bottom w:type="dxa" w:w="60"/>
+              <w:right w:type="dxa" w:w="110"/>
+            </w:tcMar>
+            <w:vAlign w:val="center"/>
+          </w:tcPr>
+          <w:p>
+            <w:pPr>
+              <w:spacing w:after="0"/>
+              <w:jc w:val="left"/>
+            </w:pPr>
+            <w:r>
+              <w:rPr>
+                <w:rFonts w:ascii="Arial" w:cs="Arial" w:eastAsia="Arial" w:hAnsi="Arial"/>
+                <w:b/>
+                <w:bCs/>
+                <w:sz w:val="18"/>
+                <w:szCs w:val="18"/>
+              </w:rPr>
+              <w:t xml:space="preserve">16</w:t>
+            </w:r>
+          </w:p>
+        </w:tc>
+        <w:tc>
+          <w:tcPr>
+            <w:tcW w:type="dxa" w:w="4560"/>
+            <w:tcBorders>
+              <w:top w:val="single" w:color="BFBFBF" w:sz="1"/>
+              <w:left w:val="single" w:color="BFBFBF" w:sz="1"/>
+              <w:bottom w:val="single" w:color="BFBFBF" w:sz="1"/>
+              <w:right w:val="single" w:color="BFBFBF" w:sz="1"/>
+            </w:tcBorders>
+            <w:shd w:fill="F4F6FB" w:val="clear"/>
+            <w:tcMar>
+              <w:top w:type="dxa" w:w="60"/>
+              <w:left w:type="dxa" w:w="110"/>
+              <w:bottom w:type="dxa" w:w="60"/>
+              <w:right w:type="dxa" w:w="110"/>
+            </w:tcMar>
+            <w:vAlign w:val="center"/>
+          </w:tcPr>
+          <w:p>
+            <w:pPr>
+              <w:spacing w:after="0"/>
+              <w:jc w:val="center"/>
+            </w:pPr>
+            <w:r>
+              <w:rPr>
+                <w:rFonts w:ascii="Arial" w:cs="Arial" w:eastAsia="Arial" w:hAnsi="Arial"/>
+                <w:b w:val="false"/>
+                <w:bCs w:val="false"/>
+                <w:sz w:val="18"/>
+                <w:szCs w:val="18"/>
+              </w:rPr>
+              <w:t xml:space="preserve">Deliverables</w:t>
+            </w:r>
+          </w:p>
+        </w:tc>
+        <w:tc>
+          <w:tcPr>
+            <w:tcW w:type="dxa" w:w="1500"/>
+            <w:tcBorders>
+              <w:top w:val="single" w:color="BFBFBF" w:sz="1"/>
+              <w:left w:val="single" w:color="BFBFBF" w:sz="1"/>
+              <w:bottom w:val="single" w:color="BFBFBF" w:sz="1"/>
+              <w:right w:val="single" w:color="BFBFBF" w:sz="1"/>
+            </w:tcBorders>
+            <w:shd w:fill="F4F6FB" w:val="clear"/>
+            <w:tcMar>
+              <w:top w:type="dxa" w:w="60"/>
+              <w:left w:type="dxa" w:w="110"/>
+              <w:bottom w:type="dxa" w:w="60"/>
+              <w:right w:type="dxa" w:w="110"/>
+            </w:tcMar>
+            <w:vAlign w:val="center"/>
+          </w:tcPr>
+          <w:p>
+            <w:pPr>
+              <w:spacing w:after="0"/>
+              <w:jc w:val="center"/>
+            </w:pPr>
+            <w:r>
+              <w:rPr>
+                <w:rFonts w:ascii="Arial" w:cs="Arial" w:eastAsia="Arial" w:hAnsi="Arial"/>
+                <w:b w:val="false"/>
+                <w:bCs w:val="false"/>
+                <w:sz w:val="18"/>
+                <w:szCs w:val="18"/>
+              </w:rPr>
+              <w:t xml:space="preserve">0:32</w:t>
+            </w:r>
+          </w:p>
+        </w:tc>
+        <w:tc>
+          <w:tcPr>
+            <w:tcW w:type="dxa" w:w="2400"/>
+            <w:tcBorders>
+              <w:top w:val="single" w:color="BFBFBF" w:sz="1"/>
+              <w:left w:val="single" w:color="BFBFBF" w:sz="1"/>
+              <w:bottom w:val="single" w:color="BFBFBF" w:sz="1"/>
+              <w:right w:val="single" w:color="BFBFBF" w:sz="1"/>
+            </w:tcBorders>
+            <w:shd w:fill="F4F6FB" w:val="clear"/>
+            <w:tcMar>
+              <w:top w:type="dxa" w:w="60"/>
+              <w:left w:type="dxa" w:w="110"/>
+              <w:bottom w:type="dxa" w:w="60"/>
+              <w:right w:type="dxa" w:w="110"/>
+            </w:tcMar>
+            <w:vAlign w:val="center"/>
+          </w:tcPr>
+          <w:p>
+            <w:pPr>
+              <w:spacing w:after="0"/>
+              <w:jc w:val="center"/>
+            </w:pPr>
+            <w:r>
+              <w:rPr>
+                <w:rFonts w:ascii="Arial" w:cs="Arial" w:eastAsia="Arial" w:hAnsi="Arial"/>
+                <w:b w:val="false"/>
+                <w:bCs w:val="false"/>
+                <w:sz w:val="18"/>
+                <w:szCs w:val="18"/>
+              </w:rPr>
+              <w:t xml:space="preserve">11:34</w:t>
+            </w:r>
+          </w:p>
+        </w:tc>
+      </w:tr>
+      <w:tr>
+        <w:tc>
+          <w:tcPr>
+            <w:tcW w:type="dxa" w:w="900"/>
+            <w:tcBorders>
+              <w:top w:val="single" w:color="BFBFBF" w:sz="1"/>
+              <w:left w:val="single" w:color="BFBFBF" w:sz="1"/>
+              <w:bottom w:val="single" w:color="BFBFBF" w:sz="1"/>
+              <w:right w:val="single" w:color="BFBFBF" w:sz="1"/>
+            </w:tcBorders>
+            <w:tcMar>
+              <w:top w:type="dxa" w:w="60"/>
+              <w:left w:type="dxa" w:w="110"/>
+              <w:bottom w:type="dxa" w:w="60"/>
+              <w:right w:type="dxa" w:w="110"/>
+            </w:tcMar>
+            <w:vAlign w:val="center"/>
+          </w:tcPr>
+          <w:p>
+            <w:pPr>
+              <w:spacing w:after="0"/>
+              <w:jc w:val="left"/>
+            </w:pPr>
+            <w:r>
+              <w:rPr>
+                <w:rFonts w:ascii="Arial" w:cs="Arial" w:eastAsia="Arial" w:hAnsi="Arial"/>
+                <w:b/>
+                <w:bCs/>
+                <w:sz w:val="18"/>
+                <w:szCs w:val="18"/>
+              </w:rPr>
+              <w:t xml:space="preserve">17</w:t>
+            </w:r>
+          </w:p>
+        </w:tc>
+        <w:tc>
+          <w:tcPr>
+            <w:tcW w:type="dxa" w:w="4560"/>
             <w:tcBorders>
               <w:top w:val="single" w:color="BFBFBF" w:sz="1"/>
               <w:left w:val="single" w:color="BFBFBF" w:sz="1"/>
@@ -2249,35 +3089,35 @@
         </w:tc>
         <w:tc>
           <w:tcPr>
-            <w:tcW w:type="dxa" w:w="1800"/>
-            <w:tcBorders>
-              <w:top w:val="single" w:color="BFBFBF" w:sz="1"/>
-              <w:left w:val="single" w:color="BFBFBF" w:sz="1"/>
-              <w:bottom w:val="single" w:color="BFBFBF" w:sz="1"/>
-              <w:right w:val="single" w:color="BFBFBF" w:sz="1"/>
-            </w:tcBorders>
-            <w:tcMar>
-              <w:top w:type="dxa" w:w="60"/>
-              <w:left w:type="dxa" w:w="110"/>
-              <w:bottom w:type="dxa" w:w="60"/>
-              <w:right w:type="dxa" w:w="110"/>
-            </w:tcMar>
-            <w:vAlign w:val="center"/>
-          </w:tcPr>
-          <w:p>
-            <w:pPr>
-              <w:spacing w:after="0"/>
-              <w:jc w:val="center"/>
-            </w:pPr>
-            <w:r>
-              <w:rPr>
-                <w:rFonts w:ascii="Arial" w:cs="Arial" w:eastAsia="Arial" w:hAnsi="Arial"/>
-                <w:b w:val="false"/>
-                <w:bCs w:val="false"/>
-                <w:sz w:val="18"/>
-                <w:szCs w:val="18"/>
-              </w:rPr>
-              <w:t xml:space="preserve">0:20</w:t>
+            <w:tcW w:type="dxa" w:w="1500"/>
+            <w:tcBorders>
+              <w:top w:val="single" w:color="BFBFBF" w:sz="1"/>
+              <w:left w:val="single" w:color="BFBFBF" w:sz="1"/>
+              <w:bottom w:val="single" w:color="BFBFBF" w:sz="1"/>
+              <w:right w:val="single" w:color="BFBFBF" w:sz="1"/>
+            </w:tcBorders>
+            <w:tcMar>
+              <w:top w:type="dxa" w:w="60"/>
+              <w:left w:type="dxa" w:w="110"/>
+              <w:bottom w:type="dxa" w:w="60"/>
+              <w:right w:type="dxa" w:w="110"/>
+            </w:tcMar>
+            <w:vAlign w:val="center"/>
+          </w:tcPr>
+          <w:p>
+            <w:pPr>
+              <w:spacing w:after="0"/>
+              <w:jc w:val="center"/>
+            </w:pPr>
+            <w:r>
+              <w:rPr>
+                <w:rFonts w:ascii="Arial" w:cs="Arial" w:eastAsia="Arial" w:hAnsi="Arial"/>
+                <w:b w:val="false"/>
+                <w:bCs w:val="false"/>
+                <w:sz w:val="18"/>
+                <w:szCs w:val="18"/>
+              </w:rPr>
+              <w:t xml:space="preserve">0:22</w:t>
             </w:r>
           </w:p>
         </w:tc>
@@ -2311,7 +3151,7 @@
                 <w:sz w:val="18"/>
                 <w:szCs w:val="18"/>
               </w:rPr>
-              <w:t xml:space="preserve">7:30</w:t>
+              <w:t xml:space="preserve">11:56</w:t>
             </w:r>
           </w:p>
         </w:tc>
@@ -2330,7 +3170,7 @@
           <w:sz w:val="20"/>
           <w:szCs w:val="20"/>
         </w:rPr>
-        <w:t xml:space="preserve">Estimated total: about 7 minutes 30 seconds, comfortably inside the 6-8 minute window.</w:t>
+        <w:t xml:space="preserve">Estimated total: about 12 minutes.</w:t>
       </w:r>
     </w:p>
     <w:p>
@@ -2352,7 +3192,7 @@
     <w:p>
       <w:pPr>
         <w:pStyle w:val="Heading2"/>
-        <w:spacing w:after="90" w:before="260"/>
+        <w:spacing w:after="90" w:before="240"/>
       </w:pPr>
       <w:r>
         <w:rPr>
@@ -2369,7 +3209,7 @@
           <w:sz w:val="20"/>
           <w:szCs w:val="20"/>
         </w:rPr>
-        <w:t xml:space="preserve">          target  0:25</w:t>
+        <w:t xml:space="preserve">          target  0:22</w:t>
       </w:r>
     </w:p>
     <w:tbl>
@@ -2432,7 +3272,7 @@
                 <w:sz w:val="23"/>
                 <w:szCs w:val="23"/>
               </w:rPr>
-              <w:t xml:space="preserve">Hi, I’m Ashik. This is my submission for the Incubyte Software Craftsperson assessment. The task was to automate ParaBank’s sign-up and login flow, and I’ve built it into a full deep-testing suite of 33 automated scenarios using Playwright, TypeScript, BDD and the Page Object Model. Let me walk you through it.</w:t>
+              <w:t xml:space="preserve">Hi, I’m Ashik. This is my submission for the Incubyte Software Craftsperson assessment - an automated test suite for the ParaBank sign-up and login flow, built with Playwright, TypeScript, BDD and the Page Object Model. It grew into 33 deep-testing scenarios that all pass. Let me walk you through it.</w:t>
             </w:r>
           </w:p>
         </w:tc>
@@ -2452,7 +3292,7 @@
     <w:p>
       <w:pPr>
         <w:pStyle w:val="Heading2"/>
-        <w:spacing w:after="90" w:before="260"/>
+        <w:spacing w:after="90" w:before="240"/>
       </w:pPr>
       <w:r>
         <w:rPr>
@@ -2469,7 +3309,7 @@
           <w:sz w:val="20"/>
           <w:szCs w:val="20"/>
         </w:rPr>
-        <w:t xml:space="preserve">          target  0:40</w:t>
+        <w:t xml:space="preserve">          target  0:38</w:t>
       </w:r>
     </w:p>
     <w:tbl>
@@ -2532,7 +3372,7 @@
                 <w:sz w:val="23"/>
                 <w:szCs w:val="23"/>
               </w:rPr>
-              <w:t xml:space="preserve">First, the assignment. The core objective was to automate creating a ParaBank account, signing in with it, and logging the balance shown after login. The deliverables were test cases in Excel, automation code on GitHub using BDD to structure the tests and BDD plus the Page Object Model for the scripts, multiple commits, and proof of execution. I treated this as a craftsmanship exercise, so I expanded the scope into deep testing across functional, boundary, security, access-control and performance.</w:t>
+              <w:t xml:space="preserve">The core task was to automate signing up for a ParaBank account, signing in with it, and logging the balance shown after login. The deliverables: test cases in Excel, automation code on GitHub using BDD and the Page Object Model, multiple commits, and proof of execution. I treated it as a craftsmanship exercise and expanded the scope into deep testing across five test types.</w:t>
             </w:r>
           </w:p>
         </w:tc>
@@ -2552,13 +3392,13 @@
     <w:p>
       <w:pPr>
         <w:pStyle w:val="Heading2"/>
-        <w:spacing w:after="90" w:before="260"/>
-      </w:pPr>
-      <w:r>
-        <w:rPr>
-          <w:rFonts w:ascii="Arial" w:cs="Arial" w:eastAsia="Arial" w:hAnsi="Arial"/>
-        </w:rPr>
-        <w:t xml:space="preserve">Slide 3  ·  Approach &amp; Tech Stack</w:t>
+        <w:spacing w:after="90" w:before="240"/>
+      </w:pPr>
+      <w:r>
+        <w:rPr>
+          <w:rFonts w:ascii="Arial" w:cs="Arial" w:eastAsia="Arial" w:hAnsi="Arial"/>
+        </w:rPr>
+        <w:t xml:space="preserve">Slide 3  ·  The Application &amp; Core Flow</w:t>
       </w:r>
       <w:r>
         <w:rPr>
@@ -2569,7 +3409,7 @@
           <w:sz w:val="20"/>
           <w:szCs w:val="20"/>
         </w:rPr>
-        <w:t xml:space="preserve">          target  0:40</w:t>
+        <w:t xml:space="preserve">          target  0:35</w:t>
       </w:r>
     </w:p>
     <w:tbl>
@@ -2632,7 +3472,7 @@
                 <w:sz w:val="23"/>
                 <w:szCs w:val="23"/>
               </w:rPr>
-              <w:t xml:space="preserve">The suite stands on three pillars. Playwright with TypeScript gives fast, reliable browser automation in fully typed code. BDD means every scenario is written in plain Gherkin - Given, When, Then - so anyone can read what is being tested. And the Page Object Model keeps every selector inside a page class, so the test steps stay clean and readable. Tying it together is playwright-bdd, which runs the Gherkin files on the Playwright engine, plus fixtures that hand ready-to-use page objects to each step.</w:t>
+              <w:t xml:space="preserve">A quick word on the application. ParaBank is Parasoft’s public online-banking demo - a real registration form, a login, and account pages on a Java backend. The core flow is three steps: register a new account, sign in with it, and read the balance shown afterwards. That flow is the backbone of the suite.</w:t>
             </w:r>
           </w:p>
         </w:tc>
@@ -2652,13 +3492,13 @@
     <w:p>
       <w:pPr>
         <w:pStyle w:val="Heading2"/>
-        <w:spacing w:after="90" w:before="260"/>
-      </w:pPr>
-      <w:r>
-        <w:rPr>
-          <w:rFonts w:ascii="Arial" w:cs="Arial" w:eastAsia="Arial" w:hAnsi="Arial"/>
-        </w:rPr>
-        <w:t xml:space="preserve">Slide 4  ·  Framework Architecture</w:t>
+        <w:spacing w:after="90" w:before="240"/>
+      </w:pPr>
+      <w:r>
+        <w:rPr>
+          <w:rFonts w:ascii="Arial" w:cs="Arial" w:eastAsia="Arial" w:hAnsi="Arial"/>
+        </w:rPr>
+        <w:t xml:space="preserve">Slide 4  ·  Approach &amp; Tech Stack</w:t>
       </w:r>
       <w:r>
         <w:rPr>
@@ -2669,7 +3509,7 @@
           <w:sz w:val="20"/>
           <w:szCs w:val="20"/>
         </w:rPr>
-        <w:t xml:space="preserve">          target  0:35</w:t>
+        <w:t xml:space="preserve">          target  0:38</w:t>
       </w:r>
     </w:p>
     <w:tbl>
@@ -2732,7 +3572,7 @@
                 <w:sz w:val="23"/>
                 <w:szCs w:val="23"/>
               </w:rPr>
-              <w:t xml:space="preserve">Architecturally, the framework is cleanly layered. Feature files describe the scenarios in Gherkin. Step definitions turn each Gherkin line into actions. Page objects hold all the locators and page interactions. And at the end is the live ParaBank application. Because of this separation the suite is readable, maintainable - a UI change is a one-place fix - repeatable thanks to a data factory, and reusable, since steps are shared across all six feature files.</w:t>
+              <w:t xml:space="preserve">The suite stands on three pillars. Playwright with TypeScript for fast, reliable, fully typed automation. BDD - every scenario is plain Gherkin, readable by anyone. And the Page Object Model, which keeps selectors inside page classes so the steps stay clean. The glue is playwright-bdd, which runs the Gherkin files on Playwright, plus fixtures that hand page objects to each step.</w:t>
             </w:r>
           </w:p>
         </w:tc>
@@ -2752,13 +3592,13 @@
     <w:p>
       <w:pPr>
         <w:pStyle w:val="Heading2"/>
-        <w:spacing w:after="90" w:before="260"/>
-      </w:pPr>
-      <w:r>
-        <w:rPr>
-          <w:rFonts w:ascii="Arial" w:cs="Arial" w:eastAsia="Arial" w:hAnsi="Arial"/>
-        </w:rPr>
-        <w:t xml:space="preserve">Slide 5  ·  Test Coverage</w:t>
+        <w:spacing w:after="90" w:before="240"/>
+      </w:pPr>
+      <w:r>
+        <w:rPr>
+          <w:rFonts w:ascii="Arial" w:cs="Arial" w:eastAsia="Arial" w:hAnsi="Arial"/>
+        </w:rPr>
+        <w:t xml:space="preserve">Slide 5  ·  Framework Architecture</w:t>
       </w:r>
       <w:r>
         <w:rPr>
@@ -2832,7 +3672,7 @@
                 <w:sz w:val="23"/>
                 <w:szCs w:val="23"/>
               </w:rPr>
-              <w:t xml:space="preserve">Now coverage. The suite has 33 automated test cases across six feature files. Six are core functional tests - registration, login and the post-login balance. Then comes the deep testing: eight boundary and validation tests, nine security tests, five access-control tests, and five performance tests. Every single case is automated - nothing is manual-only.</w:t>
+              <w:t xml:space="preserve">The framework is cleanly layered. Feature files describe the scenarios. Step definitions turn each Gherkin line into actions. Page objects hold the locators. At the end is the live application. This separation makes the suite readable, maintainable - a UI change is a one-place fix - repeatable, and reusable across all six feature files.</w:t>
             </w:r>
           </w:p>
         </w:tc>
@@ -2852,13 +3692,13 @@
     <w:p>
       <w:pPr>
         <w:pStyle w:val="Heading2"/>
-        <w:spacing w:after="90" w:before="260"/>
-      </w:pPr>
-      <w:r>
-        <w:rPr>
-          <w:rFonts w:ascii="Arial" w:cs="Arial" w:eastAsia="Arial" w:hAnsi="Arial"/>
-        </w:rPr>
-        <w:t xml:space="preserve">Slide 6  ·  Deep Testing</w:t>
+        <w:spacing w:after="90" w:before="240"/>
+      </w:pPr>
+      <w:r>
+        <w:rPr>
+          <w:rFonts w:ascii="Arial" w:cs="Arial" w:eastAsia="Arial" w:hAnsi="Arial"/>
+        </w:rPr>
+        <w:t xml:space="preserve">Slide 6  ·  BDD in Action</w:t>
       </w:r>
       <w:r>
         <w:rPr>
@@ -2869,7 +3709,7 @@
           <w:sz w:val="20"/>
           <w:szCs w:val="20"/>
         </w:rPr>
-        <w:t xml:space="preserve">          target  0:45</w:t>
+        <w:t xml:space="preserve">          target  0:38</w:t>
       </w:r>
     </w:p>
     <w:tbl>
@@ -2932,7 +3772,7 @@
                 <w:sz w:val="23"/>
                 <w:szCs w:val="23"/>
               </w:rPr>
-              <w:t xml:space="preserve">This is the heart of the suite - going beyond the happy path. Boundary testing pushes the field limits: lengths, special characters and password mismatch. Security testing fires SQL and HTML injection, checks that passwords are masked and the site uses HTTPS, and confirms that login errors do not reveal whether a username exists. Access control proves that protected pages cannot be reached without signing in. And performance measures page-load and action times against generous budgets, suited to ParaBank’s slow database backend.</w:t>
+              <w:t xml:space="preserve">Here is what BDD looks like in the suite. This is a real feature file - the scenario is plain Gherkin: Given, When, Then. It reads like a specification anyone can understand, yet Playwright executes these exact lines as an automated test. That readability is the whole point of BDD.</w:t>
             </w:r>
           </w:p>
         </w:tc>
@@ -2952,13 +3792,13 @@
     <w:p>
       <w:pPr>
         <w:pStyle w:val="Heading2"/>
-        <w:spacing w:after="90" w:before="260"/>
-      </w:pPr>
-      <w:r>
-        <w:rPr>
-          <w:rFonts w:ascii="Arial" w:cs="Arial" w:eastAsia="Arial" w:hAnsi="Arial"/>
-        </w:rPr>
-        <w:t xml:space="preserve">Slide 7  ·  Live Demo</w:t>
+        <w:spacing w:after="90" w:before="240"/>
+      </w:pPr>
+      <w:r>
+        <w:rPr>
+          <w:rFonts w:ascii="Arial" w:cs="Arial" w:eastAsia="Arial" w:hAnsi="Arial"/>
+        </w:rPr>
+        <w:t xml:space="preserve">Slide 7  ·  Page Object Model</w:t>
       </w:r>
       <w:r>
         <w:rPr>
@@ -2969,7 +3809,7 @@
           <w:sz w:val="20"/>
           <w:szCs w:val="20"/>
         </w:rPr>
-        <w:t xml:space="preserve">          target  1:45</w:t>
+        <w:t xml:space="preserve">          target  0:38</w:t>
       </w:r>
     </w:p>
     <w:tbl>
@@ -3032,7 +3872,7 @@
                 <w:sz w:val="23"/>
                 <w:szCs w:val="23"/>
               </w:rPr>
-              <w:t xml:space="preserve">Now let me show the suite actually running.   [Switch to the screen recording and narrate lightly as you go - keep this segment around a minute and a half.]</w:t>
+              <w:t xml:space="preserve">And here is the Page Object Model. Each ParaBank page is a class that holds its locators and actions - here, the HomePage with a login method. Step definitions call these methods, never raw selectors. So if the UI changes, the fix is one line, in one place. There are five page objects, all extending a shared BasePage.</w:t>
             </w:r>
           </w:p>
         </w:tc>
@@ -3040,112 +3880,6 @@
     </w:tbl>
     <w:p>
       <w:pPr>
-        <w:spacing w:after="20" w:before="120"/>
-      </w:pPr>
-      <w:r>
-        <w:rPr>
-          <w:rFonts w:ascii="Arial" w:cs="Arial" w:eastAsia="Arial" w:hAnsi="Arial"/>
-          <w:b/>
-          <w:bCs/>
-          <w:color w:val="2F5496"/>
-          <w:sz w:val="16"/>
-          <w:szCs w:val="16"/>
-        </w:rPr>
-        <w:t xml:space="preserve">DO  (screen actions)</w:t>
-      </w:r>
-    </w:p>
-    <w:p>
-      <w:pPr>
-        <w:pStyle w:val="ListParagraph"/>
-        <w:numPr>
-          <w:ilvl w:val="0"/>
-          <w:numId w:val="3"/>
-        </w:numPr>
-        <w:spacing w:after="60" w:before="80"/>
-      </w:pPr>
-      <w:r>
-        <w:rPr>
-          <w:rFonts w:ascii="Arial" w:cs="Arial" w:eastAsia="Arial" w:hAnsi="Arial"/>
-          <w:sz w:val="21"/>
-          <w:szCs w:val="21"/>
-        </w:rPr>
-        <w:t xml:space="preserve">Run "npm test" - show bddgen compiling the features, then scenarios passing in the terminal.</w:t>
-      </w:r>
-    </w:p>
-    <w:p>
-      <w:pPr>
-        <w:pStyle w:val="ListParagraph"/>
-        <w:numPr>
-          <w:ilvl w:val="0"/>
-          <w:numId w:val="3"/>
-        </w:numPr>
-        <w:spacing w:after="60" w:before="0"/>
-      </w:pPr>
-      <w:r>
-        <w:rPr>
-          <w:rFonts w:ascii="Arial" w:cs="Arial" w:eastAsia="Arial" w:hAnsi="Arial"/>
-          <w:sz w:val="21"/>
-          <w:szCs w:val="21"/>
-        </w:rPr>
-        <w:t xml:space="preserve">Show one registration scenario in the browser - the form being filled, submitted, and the result read.</w:t>
-      </w:r>
-    </w:p>
-    <w:p>
-      <w:pPr>
-        <w:pStyle w:val="ListParagraph"/>
-        <w:numPr>
-          <w:ilvl w:val="0"/>
-          <w:numId w:val="3"/>
-        </w:numPr>
-        <w:spacing w:after="60" w:before="0"/>
-      </w:pPr>
-      <w:r>
-        <w:rPr>
-          <w:rFonts w:ascii="Arial" w:cs="Arial" w:eastAsia="Arial" w:hAnsi="Arial"/>
-          <w:sz w:val="21"/>
-          <w:szCs w:val="21"/>
-        </w:rPr>
-        <w:t xml:space="preserve">Open the Monocart HTML report - click into one test to show its video, screenshots and trace.</w:t>
-      </w:r>
-    </w:p>
-    <w:p>
-      <w:pPr>
-        <w:pStyle w:val="ListParagraph"/>
-        <w:numPr>
-          <w:ilvl w:val="0"/>
-          <w:numId w:val="3"/>
-        </w:numPr>
-        <w:spacing w:after="60" w:before="0"/>
-      </w:pPr>
-      <w:r>
-        <w:rPr>
-          <w:rFonts w:ascii="Arial" w:cs="Arial" w:eastAsia="Arial" w:hAnsi="Arial"/>
-          <w:sz w:val="21"/>
-          <w:szCs w:val="21"/>
-        </w:rPr>
-        <w:t xml:space="preserve">Briefly open ParaBank_Test_Cases.xlsx so the viewer sees the documented test cases.</w:t>
-      </w:r>
-    </w:p>
-    <w:p>
-      <w:pPr>
-        <w:pStyle w:val="ListParagraph"/>
-        <w:numPr>
-          <w:ilvl w:val="0"/>
-          <w:numId w:val="3"/>
-        </w:numPr>
-        <w:spacing w:after="60" w:before="0"/>
-      </w:pPr>
-      <w:r>
-        <w:rPr>
-          <w:rFonts w:ascii="Arial" w:cs="Arial" w:eastAsia="Arial" w:hAnsi="Arial"/>
-          <w:sz w:val="21"/>
-          <w:szCs w:val="21"/>
-        </w:rPr>
-        <w:t xml:space="preserve">Then return to the slides for the wrap-up.</w:t>
-      </w:r>
-    </w:p>
-    <w:p>
-      <w:pPr>
         <w:spacing w:after="140"/>
       </w:pPr>
       <w:r>
@@ -3158,13 +3892,13 @@
     <w:p>
       <w:pPr>
         <w:pStyle w:val="Heading2"/>
-        <w:spacing w:after="90" w:before="260"/>
-      </w:pPr>
-      <w:r>
-        <w:rPr>
-          <w:rFonts w:ascii="Arial" w:cs="Arial" w:eastAsia="Arial" w:hAnsi="Arial"/>
-        </w:rPr>
-        <w:t xml:space="preserve">Slide 8  ·  Results</w:t>
+        <w:spacing w:after="90" w:before="240"/>
+      </w:pPr>
+      <w:r>
+        <w:rPr>
+          <w:rFonts w:ascii="Arial" w:cs="Arial" w:eastAsia="Arial" w:hAnsi="Arial"/>
+        </w:rPr>
+        <w:t xml:space="preserve">Slide 8  ·  Test Coverage</w:t>
       </w:r>
       <w:r>
         <w:rPr>
@@ -3175,7 +3909,7 @@
           <w:sz w:val="20"/>
           <w:szCs w:val="20"/>
         </w:rPr>
-        <w:t xml:space="preserve">          target  0:35</w:t>
+        <w:t xml:space="preserve">          target  0:32</w:t>
       </w:r>
     </w:p>
     <w:tbl>
@@ -3238,7 +3972,7 @@
                 <w:sz w:val="23"/>
                 <w:szCs w:val="23"/>
               </w:rPr>
-              <w:t xml:space="preserve">Here are the results. The full suite was run on the 24th of May - 33 of 33 scenarios passed, zero failures, in about 141 seconds, and it is 100 percent automated. Every run also produces proof automatically: a rich HTML report with video, screenshots and a network trace for every test, a plain-English executive summary, and logs capturing the balance, the performance timings and the security observations.</w:t>
+              <w:t xml:space="preserve">Coverage. The suite has 33 automated test cases across six feature files. Six are core functional tests. Then the deep testing: eight boundary tests, nine security tests, five access-control tests, and five performance tests. Every single case is automated.</w:t>
             </w:r>
           </w:p>
         </w:tc>
@@ -3258,13 +3992,13 @@
     <w:p>
       <w:pPr>
         <w:pStyle w:val="Heading2"/>
-        <w:spacing w:after="90" w:before="260"/>
-      </w:pPr>
-      <w:r>
-        <w:rPr>
-          <w:rFonts w:ascii="Arial" w:cs="Arial" w:eastAsia="Arial" w:hAnsi="Arial"/>
-        </w:rPr>
-        <w:t xml:space="preserve">Slide 9  ·  Security Finding</w:t>
+        <w:spacing w:after="90" w:before="240"/>
+      </w:pPr>
+      <w:r>
+        <w:rPr>
+          <w:rFonts w:ascii="Arial" w:cs="Arial" w:eastAsia="Arial" w:hAnsi="Arial"/>
+        </w:rPr>
+        <w:t xml:space="preserve">Slide 9  ·  Deep Testing - Boundary &amp; Validation</w:t>
       </w:r>
       <w:r>
         <w:rPr>
@@ -3275,7 +4009,7 @@
           <w:sz w:val="20"/>
           <w:szCs w:val="20"/>
         </w:rPr>
-        <w:t xml:space="preserve">          target  0:45</w:t>
+        <w:t xml:space="preserve">          target  0:40</w:t>
       </w:r>
     </w:p>
     <w:tbl>
@@ -3338,7 +4072,7 @@
                 <w:sz w:val="23"/>
                 <w:szCs w:val="23"/>
               </w:rPr>
-              <w:t xml:space="preserve">One finding I want to call out. The security suite caught a real defect - a stored cross-site-scripting vulnerability in the registration first-name field; ParaBank renders that field without escaping it. My test asserts the secure expectation - that the markup should be neutralised - so against the vulnerable site it fails. I tagged it as an expected failure, so the defect is clearly tracked while the suite stays green. A security test that catches a genuine vulnerability is doing exactly its job, and the finding is documented in both the test case workbook and the test plan.</w:t>
+              <w:t xml:space="preserve">Deep testing, part one - boundary and input validation. On registration: password mismatch, partial forms, minimum and maximum length values, and special characters. On login: empty username, empty password, and both empty. Boundary value analysis targets the edges of valid input - where defects most often hide.</w:t>
             </w:r>
           </w:p>
         </w:tc>
@@ -3358,13 +4092,13 @@
     <w:p>
       <w:pPr>
         <w:pStyle w:val="Heading2"/>
-        <w:spacing w:after="90" w:before="260"/>
-      </w:pPr>
-      <w:r>
-        <w:rPr>
-          <w:rFonts w:ascii="Arial" w:cs="Arial" w:eastAsia="Arial" w:hAnsi="Arial"/>
-        </w:rPr>
-        <w:t xml:space="preserve">Slide 10  ·  Deliverables</w:t>
+        <w:spacing w:after="90" w:before="240"/>
+      </w:pPr>
+      <w:r>
+        <w:rPr>
+          <w:rFonts w:ascii="Arial" w:cs="Arial" w:eastAsia="Arial" w:hAnsi="Arial"/>
+        </w:rPr>
+        <w:t xml:space="preserve">Slide 10  ·  Deep Testing - Security</w:t>
       </w:r>
       <w:r>
         <w:rPr>
@@ -3375,7 +4109,7 @@
           <w:sz w:val="20"/>
           <w:szCs w:val="20"/>
         </w:rPr>
-        <w:t xml:space="preserve">          target  0:25</w:t>
+        <w:t xml:space="preserve">          target  0:45</w:t>
       </w:r>
     </w:p>
     <w:tbl>
@@ -3438,7 +4172,7 @@
                 <w:sz w:val="23"/>
                 <w:szCs w:val="23"/>
               </w:rPr>
-              <w:t xml:space="preserve">So, everything that ships: the automation suite, the Excel test-case workbook, a Word test plan, the GitHub repository with an incremental commit history, a CI pipeline that runs the suite on every push, and rich reporting. Throughout, I focused on craftsmanship - typed code, small reviewable commits, reusable steps, repeatable data, and documentation a non-technical reader can follow.</w:t>
+              <w:t xml:space="preserve">Part two - security, the largest group at nine tests. Input masking on every password field. Injection defence - SQL injection in the login form and HTML injection on sign-up; the attack must not succeed. Transport and session - HTTPS, and a session cookie flagged HttpOnly. And auth hardening - login errors do not reveal whether a username exists, and repeated failed logins are consistently rejected.</w:t>
             </w:r>
           </w:p>
         </w:tc>
@@ -3458,13 +4192,13 @@
     <w:p>
       <w:pPr>
         <w:pStyle w:val="Heading2"/>
-        <w:spacing w:after="90" w:before="260"/>
-      </w:pPr>
-      <w:r>
-        <w:rPr>
-          <w:rFonts w:ascii="Arial" w:cs="Arial" w:eastAsia="Arial" w:hAnsi="Arial"/>
-        </w:rPr>
-        <w:t xml:space="preserve">Slide 11  ·  Closing</w:t>
+        <w:spacing w:after="90" w:before="240"/>
+      </w:pPr>
+      <w:r>
+        <w:rPr>
+          <w:rFonts w:ascii="Arial" w:cs="Arial" w:eastAsia="Arial" w:hAnsi="Arial"/>
+        </w:rPr>
+        <w:t xml:space="preserve">Slide 11  ·  Deep Testing - Access Control &amp; Performance</w:t>
       </w:r>
       <w:r>
         <w:rPr>
@@ -3475,7 +4209,7 @@
           <w:sz w:val="20"/>
           <w:szCs w:val="20"/>
         </w:rPr>
-        <w:t xml:space="preserve">          target  0:20</w:t>
+        <w:t xml:space="preserve">          target  0:42</w:t>
       </w:r>
     </w:p>
     <w:tbl>
@@ -3538,7 +4272,713 @@
                 <w:sz w:val="23"/>
                 <w:szCs w:val="23"/>
               </w:rPr>
-              <w:t xml:space="preserve">To recap: 33 deep-testing scenarios spanning functional, boundary, security, access-control and performance; built with BDD and the Page Object Model so it is readable and maintainable; a fully green run with proof of execution; and a real security finding that the suite caught and tracked. Thank you for watching - I’m happy to walk through any part of the code or the report.</w:t>
+              <w:t xml:space="preserve">Part three - access control and performance. Access control proves protected pages cannot be reached without signing in, or after logging out, and that a valid session persists across navigation. Performance measures five page-load and action timings, logged against generous soft budgets suited to the slow JPA backend.</w:t>
+            </w:r>
+          </w:p>
+        </w:tc>
+      </w:tr>
+    </w:tbl>
+    <w:p>
+      <w:pPr>
+        <w:spacing w:after="140"/>
+      </w:pPr>
+      <w:r>
+        <w:rPr>
+          <w:rFonts w:ascii="Arial" w:cs="Arial" w:eastAsia="Arial" w:hAnsi="Arial"/>
+        </w:rPr>
+        <w:t xml:space="preserve"/>
+      </w:r>
+    </w:p>
+    <w:p>
+      <w:pPr>
+        <w:pStyle w:val="Heading2"/>
+        <w:spacing w:after="90" w:before="240"/>
+      </w:pPr>
+      <w:r>
+        <w:rPr>
+          <w:rFonts w:ascii="Arial" w:cs="Arial" w:eastAsia="Arial" w:hAnsi="Arial"/>
+        </w:rPr>
+        <w:t xml:space="preserve">Slide 12  ·  Live Demo</w:t>
+      </w:r>
+      <w:r>
+        <w:rPr>
+          <w:rFonts w:ascii="Arial" w:cs="Arial" w:eastAsia="Arial" w:hAnsi="Arial"/>
+          <w:b/>
+          <w:bCs/>
+          <w:color w:val="147E72"/>
+          <w:sz w:val="20"/>
+          <w:szCs w:val="20"/>
+        </w:rPr>
+        <w:t xml:space="preserve">          target  2:30</w:t>
+      </w:r>
+    </w:p>
+    <w:tbl>
+      <w:tblPr>
+        <w:tblW w:type="dxa" w:w="9360"/>
+        <w:tblBorders>
+          <w:top w:val="single" w:color="auto" w:sz="4"/>
+          <w:left w:val="single" w:color="auto" w:sz="4"/>
+          <w:bottom w:val="single" w:color="auto" w:sz="4"/>
+          <w:right w:val="single" w:color="auto" w:sz="4"/>
+          <w:insideH w:val="single" w:color="auto" w:sz="4"/>
+          <w:insideV w:val="single" w:color="auto" w:sz="4"/>
+        </w:tblBorders>
+      </w:tblPr>
+      <w:tblGrid>
+        <w:gridCol w:w="9360"/>
+      </w:tblGrid>
+      <w:tr>
+        <w:tc>
+          <w:tcPr>
+            <w:tcW w:type="dxa" w:w="9360"/>
+            <w:tcBorders>
+              <w:top w:val="single" w:color="BFBFBF" w:sz="1"/>
+              <w:left w:val="single" w:color="147E72" w:sz="18"/>
+              <w:bottom w:val="single" w:color="BFBFBF" w:sz="1"/>
+              <w:right w:val="single" w:color="BFBFBF" w:sz="1"/>
+            </w:tcBorders>
+            <w:shd w:fill="EEF3FB" w:val="clear"/>
+            <w:tcMar>
+              <w:top w:type="dxa" w:w="130"/>
+              <w:left w:type="dxa" w:w="180"/>
+              <w:bottom w:type="dxa" w:w="130"/>
+              <w:right w:type="dxa" w:w="160"/>
+            </w:tcMar>
+          </w:tcPr>
+          <w:p>
+            <w:pPr>
+              <w:spacing w:after="70"/>
+            </w:pPr>
+            <w:r>
+              <w:rPr>
+                <w:rFonts w:ascii="Arial" w:cs="Arial" w:eastAsia="Arial" w:hAnsi="Arial"/>
+                <w:b/>
+                <w:bCs/>
+                <w:color w:val="147E72"/>
+                <w:sz w:val="16"/>
+                <w:szCs w:val="16"/>
+              </w:rPr>
+              <w:t xml:space="preserve">SAY</w:t>
+            </w:r>
+          </w:p>
+          <w:p>
+            <w:pPr>
+              <w:spacing w:after="0"/>
+            </w:pPr>
+            <w:r>
+              <w:rPr>
+                <w:rFonts w:ascii="Arial" w:cs="Arial" w:eastAsia="Arial" w:hAnsi="Arial"/>
+                <w:color w:val="1A1A1A"/>
+                <w:sz w:val="23"/>
+                <w:szCs w:val="23"/>
+              </w:rPr>
+              <w:t xml:space="preserve">Now let me show the suite actually running.   [Switch to the screen recording and narrate lightly as you go - keep this segment around two and a half minutes.]</w:t>
+            </w:r>
+          </w:p>
+        </w:tc>
+      </w:tr>
+    </w:tbl>
+    <w:p>
+      <w:pPr>
+        <w:spacing w:after="20" w:before="120"/>
+      </w:pPr>
+      <w:r>
+        <w:rPr>
+          <w:rFonts w:ascii="Arial" w:cs="Arial" w:eastAsia="Arial" w:hAnsi="Arial"/>
+          <w:b/>
+          <w:bCs/>
+          <w:color w:val="2F5496"/>
+          <w:sz w:val="16"/>
+          <w:szCs w:val="16"/>
+        </w:rPr>
+        <w:t xml:space="preserve">DO  (screen actions)</w:t>
+      </w:r>
+    </w:p>
+    <w:p>
+      <w:pPr>
+        <w:pStyle w:val="ListParagraph"/>
+        <w:numPr>
+          <w:ilvl w:val="0"/>
+          <w:numId w:val="3"/>
+        </w:numPr>
+        <w:spacing w:after="60" w:before="80"/>
+      </w:pPr>
+      <w:r>
+        <w:rPr>
+          <w:rFonts w:ascii="Arial" w:cs="Arial" w:eastAsia="Arial" w:hAnsi="Arial"/>
+          <w:sz w:val="21"/>
+          <w:szCs w:val="21"/>
+        </w:rPr>
+        <w:t xml:space="preserve">Run "npm test" - show bddgen compiling the features, then scenarios passing in the terminal.</w:t>
+      </w:r>
+    </w:p>
+    <w:p>
+      <w:pPr>
+        <w:pStyle w:val="ListParagraph"/>
+        <w:numPr>
+          <w:ilvl w:val="0"/>
+          <w:numId w:val="3"/>
+        </w:numPr>
+        <w:spacing w:after="60" w:before="0"/>
+      </w:pPr>
+      <w:r>
+        <w:rPr>
+          <w:rFonts w:ascii="Arial" w:cs="Arial" w:eastAsia="Arial" w:hAnsi="Arial"/>
+          <w:sz w:val="21"/>
+          <w:szCs w:val="21"/>
+        </w:rPr>
+        <w:t xml:space="preserve">Show one registration scenario in the browser - the form being filled, submitted, and the result read.</w:t>
+      </w:r>
+    </w:p>
+    <w:p>
+      <w:pPr>
+        <w:pStyle w:val="ListParagraph"/>
+        <w:numPr>
+          <w:ilvl w:val="0"/>
+          <w:numId w:val="3"/>
+        </w:numPr>
+        <w:spacing w:after="60" w:before="0"/>
+      </w:pPr>
+      <w:r>
+        <w:rPr>
+          <w:rFonts w:ascii="Arial" w:cs="Arial" w:eastAsia="Arial" w:hAnsi="Arial"/>
+          <w:sz w:val="21"/>
+          <w:szCs w:val="21"/>
+        </w:rPr>
+        <w:t xml:space="preserve">Open the Monocart HTML report - click into one test to show its video, screenshots and trace.</w:t>
+      </w:r>
+    </w:p>
+    <w:p>
+      <w:pPr>
+        <w:pStyle w:val="ListParagraph"/>
+        <w:numPr>
+          <w:ilvl w:val="0"/>
+          <w:numId w:val="3"/>
+        </w:numPr>
+        <w:spacing w:after="60" w:before="0"/>
+      </w:pPr>
+      <w:r>
+        <w:rPr>
+          <w:rFonts w:ascii="Arial" w:cs="Arial" w:eastAsia="Arial" w:hAnsi="Arial"/>
+          <w:sz w:val="21"/>
+          <w:szCs w:val="21"/>
+        </w:rPr>
+        <w:t xml:space="preserve">Briefly open ParaBank_Test_Cases.xlsx so the viewer sees the documented test cases.</w:t>
+      </w:r>
+    </w:p>
+    <w:p>
+      <w:pPr>
+        <w:pStyle w:val="ListParagraph"/>
+        <w:numPr>
+          <w:ilvl w:val="0"/>
+          <w:numId w:val="3"/>
+        </w:numPr>
+        <w:spacing w:after="60" w:before="0"/>
+      </w:pPr>
+      <w:r>
+        <w:rPr>
+          <w:rFonts w:ascii="Arial" w:cs="Arial" w:eastAsia="Arial" w:hAnsi="Arial"/>
+          <w:sz w:val="21"/>
+          <w:szCs w:val="21"/>
+        </w:rPr>
+        <w:t xml:space="preserve">Then return to the slides for the wrap-up.</w:t>
+      </w:r>
+    </w:p>
+    <w:p>
+      <w:pPr>
+        <w:spacing w:after="140"/>
+      </w:pPr>
+      <w:r>
+        <w:rPr>
+          <w:rFonts w:ascii="Arial" w:cs="Arial" w:eastAsia="Arial" w:hAnsi="Arial"/>
+        </w:rPr>
+        <w:t xml:space="preserve"/>
+      </w:r>
+    </w:p>
+    <w:p>
+      <w:pPr>
+        <w:pStyle w:val="Heading2"/>
+        <w:spacing w:after="90" w:before="240"/>
+      </w:pPr>
+      <w:r>
+        <w:rPr>
+          <w:rFonts w:ascii="Arial" w:cs="Arial" w:eastAsia="Arial" w:hAnsi="Arial"/>
+        </w:rPr>
+        <w:t xml:space="preserve">Slide 13  ·  Results</w:t>
+      </w:r>
+      <w:r>
+        <w:rPr>
+          <w:rFonts w:ascii="Arial" w:cs="Arial" w:eastAsia="Arial" w:hAnsi="Arial"/>
+          <w:b/>
+          <w:bCs/>
+          <w:color w:val="147E72"/>
+          <w:sz w:val="20"/>
+          <w:szCs w:val="20"/>
+        </w:rPr>
+        <w:t xml:space="preserve">          target  0:32</w:t>
+      </w:r>
+    </w:p>
+    <w:tbl>
+      <w:tblPr>
+        <w:tblW w:type="dxa" w:w="9360"/>
+        <w:tblBorders>
+          <w:top w:val="single" w:color="auto" w:sz="4"/>
+          <w:left w:val="single" w:color="auto" w:sz="4"/>
+          <w:bottom w:val="single" w:color="auto" w:sz="4"/>
+          <w:right w:val="single" w:color="auto" w:sz="4"/>
+          <w:insideH w:val="single" w:color="auto" w:sz="4"/>
+          <w:insideV w:val="single" w:color="auto" w:sz="4"/>
+        </w:tblBorders>
+      </w:tblPr>
+      <w:tblGrid>
+        <w:gridCol w:w="9360"/>
+      </w:tblGrid>
+      <w:tr>
+        <w:tc>
+          <w:tcPr>
+            <w:tcW w:type="dxa" w:w="9360"/>
+            <w:tcBorders>
+              <w:top w:val="single" w:color="BFBFBF" w:sz="1"/>
+              <w:left w:val="single" w:color="147E72" w:sz="18"/>
+              <w:bottom w:val="single" w:color="BFBFBF" w:sz="1"/>
+              <w:right w:val="single" w:color="BFBFBF" w:sz="1"/>
+            </w:tcBorders>
+            <w:shd w:fill="EEF3FB" w:val="clear"/>
+            <w:tcMar>
+              <w:top w:type="dxa" w:w="130"/>
+              <w:left w:type="dxa" w:w="180"/>
+              <w:bottom w:type="dxa" w:w="130"/>
+              <w:right w:type="dxa" w:w="160"/>
+            </w:tcMar>
+          </w:tcPr>
+          <w:p>
+            <w:pPr>
+              <w:spacing w:after="70"/>
+            </w:pPr>
+            <w:r>
+              <w:rPr>
+                <w:rFonts w:ascii="Arial" w:cs="Arial" w:eastAsia="Arial" w:hAnsi="Arial"/>
+                <w:b/>
+                <w:bCs/>
+                <w:color w:val="147E72"/>
+                <w:sz w:val="16"/>
+                <w:szCs w:val="16"/>
+              </w:rPr>
+              <w:t xml:space="preserve">SAY</w:t>
+            </w:r>
+          </w:p>
+          <w:p>
+            <w:pPr>
+              <w:spacing w:after="0"/>
+            </w:pPr>
+            <w:r>
+              <w:rPr>
+                <w:rFonts w:ascii="Arial" w:cs="Arial" w:eastAsia="Arial" w:hAnsi="Arial"/>
+                <w:color w:val="1A1A1A"/>
+                <w:sz w:val="23"/>
+                <w:szCs w:val="23"/>
+              </w:rPr>
+              <w:t xml:space="preserve">The results. The full suite ran on the 24th of May - 33 of 33 scenarios passed, zero failures, in about 141 seconds, and it is 100 percent automated. One command runs everything, in Chromium, serially for a stable shared environment, with unique data on every run.</w:t>
+            </w:r>
+          </w:p>
+        </w:tc>
+      </w:tr>
+    </w:tbl>
+    <w:p>
+      <w:pPr>
+        <w:spacing w:after="140"/>
+      </w:pPr>
+      <w:r>
+        <w:rPr>
+          <w:rFonts w:ascii="Arial" w:cs="Arial" w:eastAsia="Arial" w:hAnsi="Arial"/>
+        </w:rPr>
+        <w:t xml:space="preserve"/>
+      </w:r>
+    </w:p>
+    <w:p>
+      <w:pPr>
+        <w:pStyle w:val="Heading2"/>
+        <w:spacing w:after="90" w:before="240"/>
+      </w:pPr>
+      <w:r>
+        <w:rPr>
+          <w:rFonts w:ascii="Arial" w:cs="Arial" w:eastAsia="Arial" w:hAnsi="Arial"/>
+        </w:rPr>
+        <w:t xml:space="preserve">Slide 14  ·  Reporting &amp; Evidence</w:t>
+      </w:r>
+      <w:r>
+        <w:rPr>
+          <w:rFonts w:ascii="Arial" w:cs="Arial" w:eastAsia="Arial" w:hAnsi="Arial"/>
+          <w:b/>
+          <w:bCs/>
+          <w:color w:val="147E72"/>
+          <w:sz w:val="20"/>
+          <w:szCs w:val="20"/>
+        </w:rPr>
+        <w:t xml:space="preserve">          target  0:35</w:t>
+      </w:r>
+    </w:p>
+    <w:tbl>
+      <w:tblPr>
+        <w:tblW w:type="dxa" w:w="9360"/>
+        <w:tblBorders>
+          <w:top w:val="single" w:color="auto" w:sz="4"/>
+          <w:left w:val="single" w:color="auto" w:sz="4"/>
+          <w:bottom w:val="single" w:color="auto" w:sz="4"/>
+          <w:right w:val="single" w:color="auto" w:sz="4"/>
+          <w:insideH w:val="single" w:color="auto" w:sz="4"/>
+          <w:insideV w:val="single" w:color="auto" w:sz="4"/>
+        </w:tblBorders>
+      </w:tblPr>
+      <w:tblGrid>
+        <w:gridCol w:w="9360"/>
+      </w:tblGrid>
+      <w:tr>
+        <w:tc>
+          <w:tcPr>
+            <w:tcW w:type="dxa" w:w="9360"/>
+            <w:tcBorders>
+              <w:top w:val="single" w:color="BFBFBF" w:sz="1"/>
+              <w:left w:val="single" w:color="147E72" w:sz="18"/>
+              <w:bottom w:val="single" w:color="BFBFBF" w:sz="1"/>
+              <w:right w:val="single" w:color="BFBFBF" w:sz="1"/>
+            </w:tcBorders>
+            <w:shd w:fill="EEF3FB" w:val="clear"/>
+            <w:tcMar>
+              <w:top w:type="dxa" w:w="130"/>
+              <w:left w:type="dxa" w:w="180"/>
+              <w:bottom w:type="dxa" w:w="130"/>
+              <w:right w:type="dxa" w:w="160"/>
+            </w:tcMar>
+          </w:tcPr>
+          <w:p>
+            <w:pPr>
+              <w:spacing w:after="70"/>
+            </w:pPr>
+            <w:r>
+              <w:rPr>
+                <w:rFonts w:ascii="Arial" w:cs="Arial" w:eastAsia="Arial" w:hAnsi="Arial"/>
+                <w:b/>
+                <w:bCs/>
+                <w:color w:val="147E72"/>
+                <w:sz w:val="16"/>
+                <w:szCs w:val="16"/>
+              </w:rPr>
+              <w:t xml:space="preserve">SAY</w:t>
+            </w:r>
+          </w:p>
+          <w:p>
+            <w:pPr>
+              <w:spacing w:after="0"/>
+            </w:pPr>
+            <w:r>
+              <w:rPr>
+                <w:rFonts w:ascii="Arial" w:cs="Arial" w:eastAsia="Arial" w:hAnsi="Arial"/>
+                <w:color w:val="1A1A1A"/>
+                <w:sz w:val="23"/>
+                <w:szCs w:val="23"/>
+              </w:rPr>
+              <w:t xml:space="preserve">Reporting. Every run documents itself. The Monocart HTML report is interactive - browse every scenario. There is a video for every test, step screenshots and a full trace, a KPI dashboard, a plain-English summary, and logs for the balance, performance and security checks. Open the report and you see exactly what happened - that is the proof of execution.</w:t>
+            </w:r>
+          </w:p>
+        </w:tc>
+      </w:tr>
+    </w:tbl>
+    <w:p>
+      <w:pPr>
+        <w:spacing w:after="140"/>
+      </w:pPr>
+      <w:r>
+        <w:rPr>
+          <w:rFonts w:ascii="Arial" w:cs="Arial" w:eastAsia="Arial" w:hAnsi="Arial"/>
+        </w:rPr>
+        <w:t xml:space="preserve"/>
+      </w:r>
+    </w:p>
+    <w:p>
+      <w:pPr>
+        <w:pStyle w:val="Heading2"/>
+        <w:spacing w:after="90" w:before="240"/>
+      </w:pPr>
+      <w:r>
+        <w:rPr>
+          <w:rFonts w:ascii="Arial" w:cs="Arial" w:eastAsia="Arial" w:hAnsi="Arial"/>
+        </w:rPr>
+        <w:t xml:space="preserve">Slide 15  ·  Security Finding</w:t>
+      </w:r>
+      <w:r>
+        <w:rPr>
+          <w:rFonts w:ascii="Arial" w:cs="Arial" w:eastAsia="Arial" w:hAnsi="Arial"/>
+          <w:b/>
+          <w:bCs/>
+          <w:color w:val="147E72"/>
+          <w:sz w:val="20"/>
+          <w:szCs w:val="20"/>
+        </w:rPr>
+        <w:t xml:space="preserve">          target  0:42</w:t>
+      </w:r>
+    </w:p>
+    <w:tbl>
+      <w:tblPr>
+        <w:tblW w:type="dxa" w:w="9360"/>
+        <w:tblBorders>
+          <w:top w:val="single" w:color="auto" w:sz="4"/>
+          <w:left w:val="single" w:color="auto" w:sz="4"/>
+          <w:bottom w:val="single" w:color="auto" w:sz="4"/>
+          <w:right w:val="single" w:color="auto" w:sz="4"/>
+          <w:insideH w:val="single" w:color="auto" w:sz="4"/>
+          <w:insideV w:val="single" w:color="auto" w:sz="4"/>
+        </w:tblBorders>
+      </w:tblPr>
+      <w:tblGrid>
+        <w:gridCol w:w="9360"/>
+      </w:tblGrid>
+      <w:tr>
+        <w:tc>
+          <w:tcPr>
+            <w:tcW w:type="dxa" w:w="9360"/>
+            <w:tcBorders>
+              <w:top w:val="single" w:color="BFBFBF" w:sz="1"/>
+              <w:left w:val="single" w:color="147E72" w:sz="18"/>
+              <w:bottom w:val="single" w:color="BFBFBF" w:sz="1"/>
+              <w:right w:val="single" w:color="BFBFBF" w:sz="1"/>
+            </w:tcBorders>
+            <w:shd w:fill="EEF3FB" w:val="clear"/>
+            <w:tcMar>
+              <w:top w:type="dxa" w:w="130"/>
+              <w:left w:type="dxa" w:w="180"/>
+              <w:bottom w:type="dxa" w:w="130"/>
+              <w:right w:type="dxa" w:w="160"/>
+            </w:tcMar>
+          </w:tcPr>
+          <w:p>
+            <w:pPr>
+              <w:spacing w:after="70"/>
+            </w:pPr>
+            <w:r>
+              <w:rPr>
+                <w:rFonts w:ascii="Arial" w:cs="Arial" w:eastAsia="Arial" w:hAnsi="Arial"/>
+                <w:b/>
+                <w:bCs/>
+                <w:color w:val="147E72"/>
+                <w:sz w:val="16"/>
+                <w:szCs w:val="16"/>
+              </w:rPr>
+              <w:t xml:space="preserve">SAY</w:t>
+            </w:r>
+          </w:p>
+          <w:p>
+            <w:pPr>
+              <w:spacing w:after="0"/>
+            </w:pPr>
+            <w:r>
+              <w:rPr>
+                <w:rFonts w:ascii="Arial" w:cs="Arial" w:eastAsia="Arial" w:hAnsi="Arial"/>
+                <w:color w:val="1A1A1A"/>
+                <w:sz w:val="23"/>
+                <w:szCs w:val="23"/>
+              </w:rPr>
+              <w:t xml:space="preserve">One finding I want to call out. The security suite caught a real defect - a stored cross-site-scripting vulnerability in the registration first-name field; ParaBank renders that field without escaping it. My test asserts the secure expectation, so against the vulnerable site it fails - and I tagged it as an expected failure, so the defect is tracked while the suite stays green. A security test that catches a genuine vulnerability is doing exactly its job.</w:t>
+            </w:r>
+          </w:p>
+        </w:tc>
+      </w:tr>
+    </w:tbl>
+    <w:p>
+      <w:pPr>
+        <w:spacing w:after="140"/>
+      </w:pPr>
+      <w:r>
+        <w:rPr>
+          <w:rFonts w:ascii="Arial" w:cs="Arial" w:eastAsia="Arial" w:hAnsi="Arial"/>
+        </w:rPr>
+        <w:t xml:space="preserve"/>
+      </w:r>
+    </w:p>
+    <w:p>
+      <w:pPr>
+        <w:pStyle w:val="Heading2"/>
+        <w:spacing w:after="90" w:before="240"/>
+      </w:pPr>
+      <w:r>
+        <w:rPr>
+          <w:rFonts w:ascii="Arial" w:cs="Arial" w:eastAsia="Arial" w:hAnsi="Arial"/>
+        </w:rPr>
+        <w:t xml:space="preserve">Slide 16  ·  Deliverables</w:t>
+      </w:r>
+      <w:r>
+        <w:rPr>
+          <w:rFonts w:ascii="Arial" w:cs="Arial" w:eastAsia="Arial" w:hAnsi="Arial"/>
+          <w:b/>
+          <w:bCs/>
+          <w:color w:val="147E72"/>
+          <w:sz w:val="20"/>
+          <w:szCs w:val="20"/>
+        </w:rPr>
+        <w:t xml:space="preserve">          target  0:32</w:t>
+      </w:r>
+    </w:p>
+    <w:tbl>
+      <w:tblPr>
+        <w:tblW w:type="dxa" w:w="9360"/>
+        <w:tblBorders>
+          <w:top w:val="single" w:color="auto" w:sz="4"/>
+          <w:left w:val="single" w:color="auto" w:sz="4"/>
+          <w:bottom w:val="single" w:color="auto" w:sz="4"/>
+          <w:right w:val="single" w:color="auto" w:sz="4"/>
+          <w:insideH w:val="single" w:color="auto" w:sz="4"/>
+          <w:insideV w:val="single" w:color="auto" w:sz="4"/>
+        </w:tblBorders>
+      </w:tblPr>
+      <w:tblGrid>
+        <w:gridCol w:w="9360"/>
+      </w:tblGrid>
+      <w:tr>
+        <w:tc>
+          <w:tcPr>
+            <w:tcW w:type="dxa" w:w="9360"/>
+            <w:tcBorders>
+              <w:top w:val="single" w:color="BFBFBF" w:sz="1"/>
+              <w:left w:val="single" w:color="147E72" w:sz="18"/>
+              <w:bottom w:val="single" w:color="BFBFBF" w:sz="1"/>
+              <w:right w:val="single" w:color="BFBFBF" w:sz="1"/>
+            </w:tcBorders>
+            <w:shd w:fill="EEF3FB" w:val="clear"/>
+            <w:tcMar>
+              <w:top w:type="dxa" w:w="130"/>
+              <w:left w:type="dxa" w:w="180"/>
+              <w:bottom w:type="dxa" w:w="130"/>
+              <w:right w:type="dxa" w:w="160"/>
+            </w:tcMar>
+          </w:tcPr>
+          <w:p>
+            <w:pPr>
+              <w:spacing w:after="70"/>
+            </w:pPr>
+            <w:r>
+              <w:rPr>
+                <w:rFonts w:ascii="Arial" w:cs="Arial" w:eastAsia="Arial" w:hAnsi="Arial"/>
+                <w:b/>
+                <w:bCs/>
+                <w:color w:val="147E72"/>
+                <w:sz w:val="16"/>
+                <w:szCs w:val="16"/>
+              </w:rPr>
+              <w:t xml:space="preserve">SAY</w:t>
+            </w:r>
+          </w:p>
+          <w:p>
+            <w:pPr>
+              <w:spacing w:after="0"/>
+            </w:pPr>
+            <w:r>
+              <w:rPr>
+                <w:rFonts w:ascii="Arial" w:cs="Arial" w:eastAsia="Arial" w:hAnsi="Arial"/>
+                <w:color w:val="1A1A1A"/>
+                <w:sz w:val="23"/>
+                <w:szCs w:val="23"/>
+              </w:rPr>
+              <w:t xml:space="preserve">So, everything that ships: the automation suite, the Excel test-case workbook, a Word test plan, the GitHub repository with an incremental commit history, a CI pipeline that runs the suite on every push, and rich reporting. Throughout, I focused on craftsmanship - typed code, small reviewable commits, reusable steps, repeatable data, and clear documentation.</w:t>
+            </w:r>
+          </w:p>
+        </w:tc>
+      </w:tr>
+    </w:tbl>
+    <w:p>
+      <w:pPr>
+        <w:spacing w:after="140"/>
+      </w:pPr>
+      <w:r>
+        <w:rPr>
+          <w:rFonts w:ascii="Arial" w:cs="Arial" w:eastAsia="Arial" w:hAnsi="Arial"/>
+        </w:rPr>
+        <w:t xml:space="preserve"/>
+      </w:r>
+    </w:p>
+    <w:p>
+      <w:pPr>
+        <w:pStyle w:val="Heading2"/>
+        <w:spacing w:after="90" w:before="240"/>
+      </w:pPr>
+      <w:r>
+        <w:rPr>
+          <w:rFonts w:ascii="Arial" w:cs="Arial" w:eastAsia="Arial" w:hAnsi="Arial"/>
+        </w:rPr>
+        <w:t xml:space="preserve">Slide 17  ·  Closing</w:t>
+      </w:r>
+      <w:r>
+        <w:rPr>
+          <w:rFonts w:ascii="Arial" w:cs="Arial" w:eastAsia="Arial" w:hAnsi="Arial"/>
+          <w:b/>
+          <w:bCs/>
+          <w:color w:val="147E72"/>
+          <w:sz w:val="20"/>
+          <w:szCs w:val="20"/>
+        </w:rPr>
+        <w:t xml:space="preserve">          target  0:22</w:t>
+      </w:r>
+    </w:p>
+    <w:tbl>
+      <w:tblPr>
+        <w:tblW w:type="dxa" w:w="9360"/>
+        <w:tblBorders>
+          <w:top w:val="single" w:color="auto" w:sz="4"/>
+          <w:left w:val="single" w:color="auto" w:sz="4"/>
+          <w:bottom w:val="single" w:color="auto" w:sz="4"/>
+          <w:right w:val="single" w:color="auto" w:sz="4"/>
+          <w:insideH w:val="single" w:color="auto" w:sz="4"/>
+          <w:insideV w:val="single" w:color="auto" w:sz="4"/>
+        </w:tblBorders>
+      </w:tblPr>
+      <w:tblGrid>
+        <w:gridCol w:w="9360"/>
+      </w:tblGrid>
+      <w:tr>
+        <w:tc>
+          <w:tcPr>
+            <w:tcW w:type="dxa" w:w="9360"/>
+            <w:tcBorders>
+              <w:top w:val="single" w:color="BFBFBF" w:sz="1"/>
+              <w:left w:val="single" w:color="147E72" w:sz="18"/>
+              <w:bottom w:val="single" w:color="BFBFBF" w:sz="1"/>
+              <w:right w:val="single" w:color="BFBFBF" w:sz="1"/>
+            </w:tcBorders>
+            <w:shd w:fill="EEF3FB" w:val="clear"/>
+            <w:tcMar>
+              <w:top w:type="dxa" w:w="130"/>
+              <w:left w:type="dxa" w:w="180"/>
+              <w:bottom w:type="dxa" w:w="130"/>
+              <w:right w:type="dxa" w:w="160"/>
+            </w:tcMar>
+          </w:tcPr>
+          <w:p>
+            <w:pPr>
+              <w:spacing w:after="70"/>
+            </w:pPr>
+            <w:r>
+              <w:rPr>
+                <w:rFonts w:ascii="Arial" w:cs="Arial" w:eastAsia="Arial" w:hAnsi="Arial"/>
+                <w:b/>
+                <w:bCs/>
+                <w:color w:val="147E72"/>
+                <w:sz w:val="16"/>
+                <w:szCs w:val="16"/>
+              </w:rPr>
+              <w:t xml:space="preserve">SAY</w:t>
+            </w:r>
+          </w:p>
+          <w:p>
+            <w:pPr>
+              <w:spacing w:after="0"/>
+            </w:pPr>
+            <w:r>
+              <w:rPr>
+                <w:rFonts w:ascii="Arial" w:cs="Arial" w:eastAsia="Arial" w:hAnsi="Arial"/>
+                <w:color w:val="1A1A1A"/>
+                <w:sz w:val="23"/>
+                <w:szCs w:val="23"/>
+              </w:rPr>
+              <w:t xml:space="preserve">To recap: 33 deep-testing scenarios spanning functional, boundary, security, access-control and performance; built with BDD and the Page Object Model; a fully green run with proof of execution; and a real security finding the suite caught and tracked. Thank you for watching - I’m happy to walk through any part of the code or the report.</w:t>
             </w:r>
           </w:p>
         </w:tc>

</xml_diff>